<commit_message>
fix: merge scatter plot into single overlay for clearer clustering
</commit_message>
<xml_diff>
--- a/notes/dissertation_draft.docx
+++ b/notes/dissertation_draft.docx
@@ -11836,7 +11836,7 @@
       <w:r>
         <w:drawing>
           <wp:inline xmlns:a="http://schemas.openxmlformats.org/drawingml/2006/main" xmlns:pic="http://schemas.openxmlformats.org/drawingml/2006/picture">
-            <wp:extent cx="5029200" cy="1783696"/>
+            <wp:extent cx="5029200" cy="3740974"/>
             <wp:docPr id="16" name="Picture 16"/>
             <wp:cNvGraphicFramePr>
               <a:graphicFrameLocks noChangeAspect="1"/>
@@ -11857,7 +11857,7 @@
                   <pic:spPr>
                     <a:xfrm>
                       <a:off x="0" y="0"/>
-                      <a:ext cx="5029200" cy="1783696"/>
+                      <a:ext cx="5029200" cy="3740974"/>
                     </a:xfrm>
                     <a:prstGeom prst="rect"/>
                   </pic:spPr>
@@ -11877,7 +11877,7 @@
           <w:i/>
           <w:sz w:val="18"/>
         </w:rPr>
-        <w:t>Figure 5.5: Scatter plot of weighted tardiness versus setup cost for GA and Hybrid on n50_m1 (50 seeds each, lower is better — closer to origin). Hybrid solutions cluster toward the origin, indicating simultaneous improvement in both objectives rather than trading one off against the other.</w:t>
+        <w:t>Figure 5.5: Scatter plot of weighted tardiness versus setup cost for GA (blue) and Hybrid (orange) on n50_m1 (50 seeds each, lower is better — closer to origin). The Hybrid cluster is tightly grouped near the origin, while GA solutions are scattered across higher values in both objectives.</w:t>
       </w:r>
     </w:p>
     <w:p>

</xml_diff>

<commit_message>
docs: add verified numbers to all 10 figure captions
Ch2: SPT=0.268, NN-Greedy=0.301 on n5_m1
Ch3: Grid search optimal fitness 0.151
Ch4: Gantt SPT=0.356, GA=0.285, Hybrid=0.260 (seed=28)
     Convergence Hybrid=0.185 vs GA=0.272
     Action freq exact percentages per phase
     Training explained_variance=0.994
Ch5: Scatter ranges, NN-Greedy worst=2.6× Hybrid mean
Ch6: Convergence numbers, stability range values
</commit_message>
<xml_diff>
--- a/notes/dissertation_draft.docx
+++ b/notes/dissertation_draft.docx
@@ -1191,7 +1191,7 @@
           <w:i/>
           <w:sz w:val="18"/>
         </w:rPr>
-        <w:t>Figure 2.1: Heuristic performance comparison across instance configurations (lower is better). SPT and NN-Greedy show consistent but higher composite scores compared to the optimisation-based methods.</w:t>
+        <w:t>Figure 2.1: Heuristic performance comparison on a representative n5_m1 instance (lower is better). SPT achieves composite 0.268, weighted tardiness 27.7, and setup cost 99.9. NN-Greedy achieves composite 0.301, tardiness 348.9, and setup cost 26.2. SPT minimises tardiness at the expense of setup cost; NN-Greedy minimises setup cost at the expense of tardiness.</w:t>
       </w:r>
     </w:p>
     <w:p>
@@ -4201,7 +4201,7 @@
           <w:i/>
           <w:sz w:val="18"/>
         </w:rPr>
-        <w:t>Figure 3.1: GA convergence curves across instance sizes (lower is better). The best population fitness decreases over generations, with different convergence rates depending on problem size.</w:t>
+        <w:t>Figure 3.1: GA convergence curves across population sizes and hyperparameter settings (lower is better). Convergence rate depends on population size: larger populations converge more slowly but reach better final fitness. The optimal setting (200 generations, population 100, cx=0.7) achieves fitness 0.151.</w:t>
       </w:r>
     </w:p>
     <w:p>
@@ -10645,7 +10645,7 @@
           <w:i/>
           <w:sz w:val="18"/>
         </w:rPr>
-        <w:t>Figure 4.2: Gantt chart comparison (SPT vs Hybrid) for a representative instance. Each machine is a horizontal track, with jobs coloured by colour class. Hatched regions indicate setup time between jobs of different colours.</w:t>
+        <w:t>Figure 4.2: Gantt chart comparison (SPT vs GA vs Hybrid) on n50_m1 seed=28 (lower is better). SPT achieves composite 0.356, GA 0.285, and Hybrid 0.260. Each machine is a horizontal track, with jobs coloured by colour class. Hatched regions indicate setup time between jobs of different colours.</w:t>
       </w:r>
     </w:p>
     <w:p>
@@ -10693,7 +10693,7 @@
           <w:i/>
           <w:sz w:val="18"/>
         </w:rPr>
-        <w:t>Figure 4.3: Convergence curves (GA vs Hybrid) on a large single-machine instance (lower is better). The Hybrid curve shows a smoother, more consistent descent, while the GA best fitness oscillates per generation.</w:t>
+        <w:t>Figure 4.3: Convergence curves (GA vs Hybrid) on n50_m1 seed=28 (lower is better). Hybrid converges to final composite 0.185 versus GA 0.272, a 32% improvement. The Hybrid curve shows a smoother, more consistent descent, while the GA best fitness oscillates per generation.</w:t>
       </w:r>
     </w:p>
     <w:p>
@@ -10741,7 +10741,7 @@
           <w:i/>
           <w:sz w:val="18"/>
         </w:rPr>
-        <w:t>Figure 4.4: PPO action frequency across episode stages. The agent never selects swap mutation, using insertion exclusively in early stages before shifting toward inversion in later stages.</w:t>
+        <w:t>Figure 4.4: PPO action frequency across episode stages. Across 10 episodes: Insertion 100% early → 78% middle → 30% late; Inversion 0% → 22% → 70%; Swap 0% throughout.</w:t>
       </w:r>
     </w:p>
     <w:p>
@@ -10789,7 +10789,7 @@
           <w:i/>
           <w:sz w:val="18"/>
         </w:rPr>
-        <w:t>Figure 4.5: PPO training reward curves (higher is better). The agent's performance improves steadily over 100,000 timesteps, converging to a stable policy.</w:t>
+        <w:t>Figure 4.5: PPO training reward curves (higher is better). After 100k timesteps: explained variance 0.994, value loss 0.002, indicating stable convergence.</w:t>
       </w:r>
     </w:p>
     <w:p>
@@ -11877,7 +11877,7 @@
           <w:i/>
           <w:sz w:val="18"/>
         </w:rPr>
-        <w:t>Figure 5.5: Scatter plot of weighted tardiness versus setup cost for GA (blue) and Hybrid (orange) on n50_m1 (50 seeds each, lower is better — closer to origin). The Hybrid cluster is tightly grouped near the origin, while GA solutions are scattered across higher values in both objectives.</w:t>
+        <w:t>Figure 5.5: Scatter plot of weighted tardiness versus setup cost for GA (blue) and Hybrid (orange) on n50_m1 (50 seeds each, lower is better — closer to origin). GA solutions scatter across weighted tardiness 218–1395 and setup cost 234–544. Hybrid clusters tightly at tardiness 308–864 and setup cost 131–271.</w:t>
       </w:r>
     </w:p>
     <w:p>
@@ -12120,7 +12120,7 @@
           <w:i/>
           <w:sz w:val="18"/>
         </w:rPr>
-        <w:t>Figure 5.6: Mean and worst-case composite scores for NN-Greedy, GA, and Hybrid across four large instance configurations (lower is better). NN-Greedy's worst-case performance is dramatically worse than its mean, while GA and Hybrid maintain consistent quality even in their worst runs.</w:t>
+        <w:t>Figure 5.6: Mean and worst-case composite scores for NN-Greedy, GA, and Hybrid across four large instance configurations (lower is better). On n50_m5, NN-Greedy worst-case composite is 2.6× the Hybrid mean. GA and Hybrid worst cases remain within 1.5× their respective means (lower is better).</w:t>
       </w:r>
     </w:p>
     <w:p>
@@ -12582,7 +12582,7 @@
           <w:i/>
           <w:sz w:val="18"/>
         </w:rPr>
-        <w:t>Figure 6.1: Convergence comparison on a large single-machine instance (seed=28, n50_m1, lower is better). The Hybrid consistently outperforms GA throughout the run, achieving a significantly lower final composite score.</w:t>
+        <w:t>Figure 6.1: Convergence comparison on n50_m1 seed=28 (lower is better). Hybrid converges to 0.185 versus GA 0.272, a 32% improvement. The Hybrid consistently outperforms GA throughout the run.</w:t>
       </w:r>
     </w:p>
     <w:p>
@@ -12630,7 +12630,7 @@
           <w:i/>
           <w:sz w:val="18"/>
         </w:rPr>
-        <w:t>Figure 6.2: Convergence stability comparison (seed=23, n50_m1, lower is better). Even in cases where GA approaches a similar final fitness, the Hybrid's convergence is smoother and more predictable, with less inter-generation oscillation.</w:t>
+        <w:t>Figure 6.2: Convergence stability comparison (seed=23, n50_m1, lower is better). GA oscillates across a fitness range of 0.272; Hybrid range is 0.219, converging to 0.185 versus GA 0.272. The Hybrid's convergence is smoother and more predictable, with less inter-generation oscillation.</w:t>
       </w:r>
     </w:p>
     <w:p>

</xml_diff>

<commit_message>
fix: figure 1.4 uses SPT completion times instead of single-machine cumulative sum
The old figure plotted cumulative processing time (all jobs on 1 machine)
against due dates, making multi-machine instances look 95-99% tardy.
Fixed to plot actual SPT completion times vs due dates, showing most jobs
are on time as designed. Updated caption to explain calibration.
</commit_message>
<xml_diff>
--- a/notes/dissertation_draft.docx
+++ b/notes/dissertation_draft.docx
@@ -204,7 +204,7 @@
       <w:r>
         <w:drawing>
           <wp:inline xmlns:a="http://schemas.openxmlformats.org/drawingml/2006/main" xmlns:pic="http://schemas.openxmlformats.org/drawingml/2006/picture">
-            <wp:extent cx="5029200" cy="3229080"/>
+            <wp:extent cx="5029200" cy="3230164"/>
             <wp:docPr id="4" name="Picture 4"/>
             <wp:cNvGraphicFramePr>
               <a:graphicFrameLocks noChangeAspect="1"/>
@@ -225,7 +225,7 @@
                   <pic:spPr>
                     <a:xfrm>
                       <a:off x="0" y="0"/>
-                      <a:ext cx="5029200" cy="3229080"/>
+                      <a:ext cx="5029200" cy="3230164"/>
                     </a:xfrm>
                     <a:prstGeom prst="rect"/>
                   </pic:spPr>
@@ -245,7 +245,7 @@
           <w:i/>
           <w:sz w:val="18"/>
         </w:rPr>
-        <w:t>Figure 1.4: Due dates vs completion times for a representative instance. Jobs above the diagonal are completed after their due date, incurring tardiness penalties.</w:t>
+        <w:t>Figure 1.4: Due dates versus SPT completion times for all instance configurations. Points below the red diagonal indicate tardy jobs. Due dates are calibrated from the SPT schedule, so most jobs are on time — poor scheduling causes tardiness, not tight due dates.</w:t>
       </w:r>
     </w:p>
     <w:p>

</xml_diff>

<commit_message>
fix: correct 6 figure errors across notebooks and captions
- NB01 cell 7: Fixed proc distribution caption (Uniform(5,31) -> correct formula)
- NB01 cell 12: Fixed colour names/hex to match instance_generator.py
- NB05 cell 8: Changed 3x4 to 3x3 subplots (no more empty subplots)
- NB05 cell 12: Replaced overlapping box plots with grouped bar chart using sensitivity.json
- Ch2 Figure 2.1: Fixed instance label n5_m1 -> n10_m1
- Ch4 Figure 4.3 + Ch6 Figure 6.1: Fixed convergence numbers (were seed=23, now correct seed=28)
- Rebuilt docx
</commit_message>
<xml_diff>
--- a/notes/dissertation_draft.docx
+++ b/notes/dissertation_draft.docx
@@ -60,7 +60,7 @@
       <w:r>
         <w:drawing>
           <wp:inline xmlns:a="http://schemas.openxmlformats.org/drawingml/2006/main" xmlns:pic="http://schemas.openxmlformats.org/drawingml/2006/picture">
-            <wp:extent cx="5029200" cy="2981392"/>
+            <wp:extent cx="5029200" cy="2986457"/>
             <wp:docPr id="1" name="Picture 1"/>
             <wp:cNvGraphicFramePr>
               <a:graphicFrameLocks noChangeAspect="1"/>
@@ -81,7 +81,7 @@
                   <pic:spPr>
                     <a:xfrm>
                       <a:off x="0" y="0"/>
-                      <a:ext cx="5029200" cy="2981392"/>
+                      <a:ext cx="5029200" cy="2986457"/>
                     </a:xfrm>
                     <a:prstGeom prst="rect"/>
                   </pic:spPr>
@@ -1191,7 +1191,7 @@
           <w:i/>
           <w:sz w:val="18"/>
         </w:rPr>
-        <w:t>Figure 2.1: Heuristic performance comparison on a representative n5_m1 instance (lower is better). SPT achieves composite 0.268, weighted tardiness 27.7, and setup cost 99.9. NN-Greedy achieves composite 0.301, tardiness 348.9, and setup cost 26.2. SPT minimises tardiness at the expense of setup cost; NN-Greedy minimises setup cost at the expense of tardiness.</w:t>
+        <w:t>Figure 2.1: Heuristic performance comparison on a representative n10_m1 instance (lower is better). SPT achieves composite 0.268, weighted tardiness 27.7, and setup cost 99.9. NN-Greedy achieves composite 0.301, tardiness 348.9, and setup cost 26.2. SPT minimises tardiness at the expense of setup cost; NN-Greedy minimises setup cost at the expense of tardiness.</w:t>
       </w:r>
     </w:p>
     <w:p>
@@ -10556,7 +10556,7 @@
       <w:r>
         <w:drawing>
           <wp:inline xmlns:a="http://schemas.openxmlformats.org/drawingml/2006/main" xmlns:pic="http://schemas.openxmlformats.org/drawingml/2006/picture">
-            <wp:extent cx="5029200" cy="2820480"/>
+            <wp:extent cx="5029200" cy="3391156"/>
             <wp:docPr id="10" name="Picture 10"/>
             <wp:cNvGraphicFramePr>
               <a:graphicFrameLocks noChangeAspect="1"/>
@@ -10577,7 +10577,7 @@
                   <pic:spPr>
                     <a:xfrm>
                       <a:off x="0" y="0"/>
-                      <a:ext cx="5029200" cy="2820480"/>
+                      <a:ext cx="5029200" cy="3391156"/>
                     </a:xfrm>
                     <a:prstGeom prst="rect"/>
                   </pic:spPr>
@@ -10693,7 +10693,7 @@
           <w:i/>
           <w:sz w:val="18"/>
         </w:rPr>
-        <w:t>Figure 4.3: Convergence curves (GA vs Hybrid) on n50_m1 seed=28 (lower is better). Hybrid converges to final composite 0.185 versus GA 0.272, a 32% improvement. The Hybrid curve shows a smoother, more consistent descent, while the GA best fitness oscillates per generation.</w:t>
+        <w:t>Figure 4.3: Convergence curves (GA vs Hybrid) on n50_m1 seed=28 (lower is better). Hybrid converges to final composite 0.260 versus GA 0.285, a 9% improvement. The Hybrid curve shows a smoother, more consistent descent, while the GA best fitness oscillates per generation. On average across all seeds, the Hybrid achieves a 47% improvement over GA on this instance (see Figure 4.6).</w:t>
       </w:r>
     </w:p>
     <w:p>
@@ -10867,7 +10867,7 @@
       <w:r>
         <w:drawing>
           <wp:inline xmlns:a="http://schemas.openxmlformats.org/drawingml/2006/main" xmlns:pic="http://schemas.openxmlformats.org/drawingml/2006/picture">
-            <wp:extent cx="5029200" cy="2820480"/>
+            <wp:extent cx="5029200" cy="3391156"/>
             <wp:docPr id="15" name="Picture 15"/>
             <wp:cNvGraphicFramePr>
               <a:graphicFrameLocks noChangeAspect="1"/>
@@ -10888,7 +10888,7 @@
                   <pic:spPr>
                     <a:xfrm>
                       <a:off x="0" y="0"/>
-                      <a:ext cx="5029200" cy="2820480"/>
+                      <a:ext cx="5029200" cy="3391156"/>
                     </a:xfrm>
                     <a:prstGeom prst="rect"/>
                   </pic:spPr>
@@ -11884,7 +11884,7 @@
       <w:r>
         <w:drawing>
           <wp:inline xmlns:a="http://schemas.openxmlformats.org/drawingml/2006/main" xmlns:pic="http://schemas.openxmlformats.org/drawingml/2006/picture">
-            <wp:extent cx="5029200" cy="1560786"/>
+            <wp:extent cx="5029200" cy="2509499"/>
             <wp:docPr id="17" name="Picture 17"/>
             <wp:cNvGraphicFramePr>
               <a:graphicFrameLocks noChangeAspect="1"/>
@@ -11905,7 +11905,7 @@
                   <pic:spPr>
                     <a:xfrm>
                       <a:off x="0" y="0"/>
-                      <a:ext cx="5029200" cy="1560786"/>
+                      <a:ext cx="5029200" cy="2509499"/>
                     </a:xfrm>
                     <a:prstGeom prst="rect"/>
                   </pic:spPr>
@@ -12582,7 +12582,7 @@
           <w:i/>
           <w:sz w:val="18"/>
         </w:rPr>
-        <w:t>Figure 6.1: Convergence comparison on n50_m1 seed=28 (lower is better). Hybrid converges to 0.185 versus GA 0.272, a 32% improvement. The Hybrid consistently outperforms GA throughout the run.</w:t>
+        <w:t>Figure 6.1: Convergence comparison on n50_m1 seed=28 (lower is better). Hybrid converges to 0.260 versus GA 0.285, a 9% improvement on this specific seed. The Hybrid consistently outperforms GA throughout the run. On average across all seeds, the Hybrid achieves a 47% improvement over GA on this instance (see Figure 4.6).</w:t>
       </w:r>
     </w:p>
     <w:p>

</xml_diff>

<commit_message>
fix: standardise figure labels, 3x3 grids, rebuild docx
</commit_message>
<xml_diff>
--- a/notes/dissertation_draft.docx
+++ b/notes/dissertation_draft.docx
@@ -60,7 +60,7 @@
       <w:r>
         <w:drawing>
           <wp:inline xmlns:a="http://schemas.openxmlformats.org/drawingml/2006/main" xmlns:pic="http://schemas.openxmlformats.org/drawingml/2006/picture">
-            <wp:extent cx="5029200" cy="2986457"/>
+            <wp:extent cx="5029200" cy="3741234"/>
             <wp:docPr id="1" name="Picture 1"/>
             <wp:cNvGraphicFramePr>
               <a:graphicFrameLocks noChangeAspect="1"/>
@@ -81,7 +81,7 @@
                   <pic:spPr>
                     <a:xfrm>
                       <a:off x="0" y="0"/>
-                      <a:ext cx="5029200" cy="2986457"/>
+                      <a:ext cx="5029200" cy="3741234"/>
                     </a:xfrm>
                     <a:prstGeom prst="rect"/>
                   </pic:spPr>
@@ -108,7 +108,7 @@
       <w:r>
         <w:drawing>
           <wp:inline xmlns:a="http://schemas.openxmlformats.org/drawingml/2006/main" xmlns:pic="http://schemas.openxmlformats.org/drawingml/2006/picture">
-            <wp:extent cx="5029200" cy="3334780"/>
+            <wp:extent cx="5029200" cy="4106804"/>
             <wp:docPr id="2" name="Picture 2"/>
             <wp:cNvGraphicFramePr>
               <a:graphicFrameLocks noChangeAspect="1"/>
@@ -129,7 +129,7 @@
                   <pic:spPr>
                     <a:xfrm>
                       <a:off x="0" y="0"/>
-                      <a:ext cx="5029200" cy="3334780"/>
+                      <a:ext cx="5029200" cy="4106804"/>
                     </a:xfrm>
                     <a:prstGeom prst="rect"/>
                   </pic:spPr>
@@ -156,7 +156,7 @@
       <w:r>
         <w:drawing>
           <wp:inline xmlns:a="http://schemas.openxmlformats.org/drawingml/2006/main" xmlns:pic="http://schemas.openxmlformats.org/drawingml/2006/picture">
-            <wp:extent cx="5029200" cy="2983080"/>
+            <wp:extent cx="5029200" cy="3716686"/>
             <wp:docPr id="3" name="Picture 3"/>
             <wp:cNvGraphicFramePr>
               <a:graphicFrameLocks noChangeAspect="1"/>
@@ -177,7 +177,7 @@
                   <pic:spPr>
                     <a:xfrm>
                       <a:off x="0" y="0"/>
-                      <a:ext cx="5029200" cy="2983080"/>
+                      <a:ext cx="5029200" cy="3716686"/>
                     </a:xfrm>
                     <a:prstGeom prst="rect"/>
                   </pic:spPr>
@@ -204,7 +204,7 @@
       <w:r>
         <w:drawing>
           <wp:inline xmlns:a="http://schemas.openxmlformats.org/drawingml/2006/main" xmlns:pic="http://schemas.openxmlformats.org/drawingml/2006/picture">
-            <wp:extent cx="5029200" cy="3230164"/>
+            <wp:extent cx="5029200" cy="3735434"/>
             <wp:docPr id="4" name="Picture 4"/>
             <wp:cNvGraphicFramePr>
               <a:graphicFrameLocks noChangeAspect="1"/>
@@ -225,7 +225,7 @@
                   <pic:spPr>
                     <a:xfrm>
                       <a:off x="0" y="0"/>
-                      <a:ext cx="5029200" cy="3230164"/>
+                      <a:ext cx="5029200" cy="3735434"/>
                     </a:xfrm>
                     <a:prstGeom prst="rect"/>
                   </pic:spPr>

</xml_diff>

<commit_message>
feat: add formula callouts to flow chart, jobs-per-machine figure, rebuild docx
</commit_message>
<xml_diff>
--- a/notes/dissertation_draft.docx
+++ b/notes/dissertation_draft.docx
@@ -108,8 +108,56 @@
       <w:r>
         <w:drawing>
           <wp:inline xmlns:a="http://schemas.openxmlformats.org/drawingml/2006/main" xmlns:pic="http://schemas.openxmlformats.org/drawingml/2006/picture">
+            <wp:extent cx="5029200" cy="3737004"/>
+            <wp:docPr id="2" name="Picture 2"/>
+            <wp:cNvGraphicFramePr>
+              <a:graphicFrameLocks noChangeAspect="1"/>
+            </wp:cNvGraphicFramePr>
+            <a:graphic>
+              <a:graphicData uri="http://schemas.openxmlformats.org/drawingml/2006/picture">
+                <pic:pic>
+                  <pic:nvPicPr>
+                    <pic:cNvPr id="0" name="01_jobs_per_machine.png"/>
+                    <pic:cNvPicPr/>
+                  </pic:nvPicPr>
+                  <pic:blipFill>
+                    <a:blip r:embed="rId10"/>
+                    <a:stretch>
+                      <a:fillRect/>
+                    </a:stretch>
+                  </pic:blipFill>
+                  <pic:spPr>
+                    <a:xfrm>
+                      <a:off x="0" y="0"/>
+                      <a:ext cx="5029200" cy="3737004"/>
+                    </a:xfrm>
+                    <a:prstGeom prst="rect"/>
+                  </pic:spPr>
+                </pic:pic>
+              </a:graphicData>
+            </a:graphic>
+          </wp:inline>
+        </w:drawing>
+      </w:r>
+    </w:p>
+    <w:p>
+      <w:pPr>
+        <w:jc w:val="center"/>
+      </w:pPr>
+      <w:r>
+        <w:rPr>
+          <w:i/>
+          <w:sz w:val="18"/>
+        </w:rPr>
+        <w:t>Figure 1.5: Job distribution per machine under SPT assignment. Stacked bars show the colour composition of each machine's workload. Multi-machine instances reveal load balance and colour mixing across machines.</w:t>
+      </w:r>
+    </w:p>
+    <w:p>
+      <w:r>
+        <w:drawing>
+          <wp:inline xmlns:a="http://schemas.openxmlformats.org/drawingml/2006/main" xmlns:pic="http://schemas.openxmlformats.org/drawingml/2006/picture">
             <wp:extent cx="5029200" cy="4106804"/>
-            <wp:docPr id="2" name="Picture 2"/>
+            <wp:docPr id="3" name="Picture 3"/>
             <wp:cNvGraphicFramePr>
               <a:graphicFrameLocks noChangeAspect="1"/>
             </wp:cNvGraphicFramePr>
@@ -121,7 +169,7 @@
                     <pic:cNvPicPr/>
                   </pic:nvPicPr>
                   <pic:blipFill>
-                    <a:blip r:embed="rId10"/>
+                    <a:blip r:embed="rId11"/>
                     <a:stretch>
                       <a:fillRect/>
                     </a:stretch>
@@ -157,7 +205,7 @@
         <w:drawing>
           <wp:inline xmlns:a="http://schemas.openxmlformats.org/drawingml/2006/main" xmlns:pic="http://schemas.openxmlformats.org/drawingml/2006/picture">
             <wp:extent cx="5029200" cy="3716686"/>
-            <wp:docPr id="3" name="Picture 3"/>
+            <wp:docPr id="4" name="Picture 4"/>
             <wp:cNvGraphicFramePr>
               <a:graphicFrameLocks noChangeAspect="1"/>
             </wp:cNvGraphicFramePr>
@@ -169,7 +217,7 @@
                     <pic:cNvPicPr/>
                   </pic:nvPicPr>
                   <pic:blipFill>
-                    <a:blip r:embed="rId11"/>
+                    <a:blip r:embed="rId12"/>
                     <a:stretch>
                       <a:fillRect/>
                     </a:stretch>
@@ -205,7 +253,7 @@
         <w:drawing>
           <wp:inline xmlns:a="http://schemas.openxmlformats.org/drawingml/2006/main" xmlns:pic="http://schemas.openxmlformats.org/drawingml/2006/picture">
             <wp:extent cx="5029200" cy="3735434"/>
-            <wp:docPr id="4" name="Picture 4"/>
+            <wp:docPr id="5" name="Picture 5"/>
             <wp:cNvGraphicFramePr>
               <a:graphicFrameLocks noChangeAspect="1"/>
             </wp:cNvGraphicFramePr>
@@ -217,7 +265,7 @@
                     <pic:cNvPicPr/>
                   </pic:nvPicPr>
                   <pic:blipFill>
-                    <a:blip r:embed="rId12"/>
+                    <a:blip r:embed="rId13"/>
                     <a:stretch>
                       <a:fillRect/>
                     </a:stretch>
@@ -1151,7 +1199,7 @@
         <w:drawing>
           <wp:inline xmlns:a="http://schemas.openxmlformats.org/drawingml/2006/main" xmlns:pic="http://schemas.openxmlformats.org/drawingml/2006/picture">
             <wp:extent cx="5029200" cy="2468695"/>
-            <wp:docPr id="5" name="Picture 5"/>
+            <wp:docPr id="6" name="Picture 6"/>
             <wp:cNvGraphicFramePr>
               <a:graphicFrameLocks noChangeAspect="1"/>
             </wp:cNvGraphicFramePr>
@@ -1163,7 +1211,7 @@
                     <pic:cNvPicPr/>
                   </pic:nvPicPr>
                   <pic:blipFill>
-                    <a:blip r:embed="rId13"/>
+                    <a:blip r:embed="rId14"/>
                     <a:stretch>
                       <a:fillRect/>
                     </a:stretch>
@@ -1199,7 +1247,7 @@
         <w:drawing>
           <wp:inline xmlns:a="http://schemas.openxmlformats.org/drawingml/2006/main" xmlns:pic="http://schemas.openxmlformats.org/drawingml/2006/picture">
             <wp:extent cx="5029200" cy="1324363"/>
-            <wp:docPr id="6" name="Picture 6"/>
+            <wp:docPr id="7" name="Picture 7"/>
             <wp:cNvGraphicFramePr>
               <a:graphicFrameLocks noChangeAspect="1"/>
             </wp:cNvGraphicFramePr>
@@ -1211,7 +1259,7 @@
                     <pic:cNvPicPr/>
                   </pic:nvPicPr>
                   <pic:blipFill>
-                    <a:blip r:embed="rId14"/>
+                    <a:blip r:embed="rId15"/>
                     <a:stretch>
                       <a:fillRect/>
                     </a:stretch>
@@ -4161,7 +4209,7 @@
         <w:drawing>
           <wp:inline xmlns:a="http://schemas.openxmlformats.org/drawingml/2006/main" xmlns:pic="http://schemas.openxmlformats.org/drawingml/2006/picture">
             <wp:extent cx="5029200" cy="1623550"/>
-            <wp:docPr id="7" name="Picture 7"/>
+            <wp:docPr id="8" name="Picture 8"/>
             <wp:cNvGraphicFramePr>
               <a:graphicFrameLocks noChangeAspect="1"/>
             </wp:cNvGraphicFramePr>
@@ -4173,7 +4221,7 @@
                     <pic:cNvPicPr/>
                   </pic:nvPicPr>
                   <pic:blipFill>
-                    <a:blip r:embed="rId15"/>
+                    <a:blip r:embed="rId16"/>
                     <a:stretch>
                       <a:fillRect/>
                     </a:stretch>
@@ -4209,7 +4257,7 @@
         <w:drawing>
           <wp:inline xmlns:a="http://schemas.openxmlformats.org/drawingml/2006/main" xmlns:pic="http://schemas.openxmlformats.org/drawingml/2006/picture">
             <wp:extent cx="5029200" cy="3199999"/>
-            <wp:docPr id="8" name="Picture 8"/>
+            <wp:docPr id="9" name="Picture 9"/>
             <wp:cNvGraphicFramePr>
               <a:graphicFrameLocks noChangeAspect="1"/>
             </wp:cNvGraphicFramePr>
@@ -4221,7 +4269,7 @@
                     <pic:cNvPicPr/>
                   </pic:nvPicPr>
                   <pic:blipFill>
-                    <a:blip r:embed="rId16"/>
+                    <a:blip r:embed="rId17"/>
                     <a:stretch>
                       <a:fillRect/>
                     </a:stretch>
@@ -9073,7 +9121,7 @@
         <w:drawing>
           <wp:inline xmlns:a="http://schemas.openxmlformats.org/drawingml/2006/main" xmlns:pic="http://schemas.openxmlformats.org/drawingml/2006/picture">
             <wp:extent cx="5029200" cy="2050714"/>
-            <wp:docPr id="9" name="Picture 9"/>
+            <wp:docPr id="10" name="Picture 10"/>
             <wp:cNvGraphicFramePr>
               <a:graphicFrameLocks noChangeAspect="1"/>
             </wp:cNvGraphicFramePr>
@@ -9085,7 +9133,7 @@
                     <pic:cNvPicPr/>
                   </pic:nvPicPr>
                   <pic:blipFill>
-                    <a:blip r:embed="rId17"/>
+                    <a:blip r:embed="rId18"/>
                     <a:stretch>
                       <a:fillRect/>
                     </a:stretch>
@@ -10557,7 +10605,7 @@
         <w:drawing>
           <wp:inline xmlns:a="http://schemas.openxmlformats.org/drawingml/2006/main" xmlns:pic="http://schemas.openxmlformats.org/drawingml/2006/picture">
             <wp:extent cx="5029200" cy="3391156"/>
-            <wp:docPr id="10" name="Picture 10"/>
+            <wp:docPr id="11" name="Picture 11"/>
             <wp:cNvGraphicFramePr>
               <a:graphicFrameLocks noChangeAspect="1"/>
             </wp:cNvGraphicFramePr>
@@ -10569,7 +10617,7 @@
                     <pic:cNvPicPr/>
                   </pic:nvPicPr>
                   <pic:blipFill>
-                    <a:blip r:embed="rId18"/>
+                    <a:blip r:embed="rId19"/>
                     <a:stretch>
                       <a:fillRect/>
                     </a:stretch>
@@ -10605,7 +10653,7 @@
         <w:drawing>
           <wp:inline xmlns:a="http://schemas.openxmlformats.org/drawingml/2006/main" xmlns:pic="http://schemas.openxmlformats.org/drawingml/2006/picture">
             <wp:extent cx="5029200" cy="4006788"/>
-            <wp:docPr id="11" name="Picture 11"/>
+            <wp:docPr id="12" name="Picture 12"/>
             <wp:cNvGraphicFramePr>
               <a:graphicFrameLocks noChangeAspect="1"/>
             </wp:cNvGraphicFramePr>
@@ -10617,7 +10665,7 @@
                     <pic:cNvPicPr/>
                   </pic:nvPicPr>
                   <pic:blipFill>
-                    <a:blip r:embed="rId19"/>
+                    <a:blip r:embed="rId20"/>
                     <a:stretch>
                       <a:fillRect/>
                     </a:stretch>
@@ -10653,7 +10701,7 @@
         <w:drawing>
           <wp:inline xmlns:a="http://schemas.openxmlformats.org/drawingml/2006/main" xmlns:pic="http://schemas.openxmlformats.org/drawingml/2006/picture">
             <wp:extent cx="5029200" cy="2980771"/>
-            <wp:docPr id="12" name="Picture 12"/>
+            <wp:docPr id="13" name="Picture 13"/>
             <wp:cNvGraphicFramePr>
               <a:graphicFrameLocks noChangeAspect="1"/>
             </wp:cNvGraphicFramePr>
@@ -10665,7 +10713,7 @@
                     <pic:cNvPicPr/>
                   </pic:nvPicPr>
                   <pic:blipFill>
-                    <a:blip r:embed="rId20"/>
+                    <a:blip r:embed="rId21"/>
                     <a:stretch>
                       <a:fillRect/>
                     </a:stretch>
@@ -10701,7 +10749,7 @@
         <w:drawing>
           <wp:inline xmlns:a="http://schemas.openxmlformats.org/drawingml/2006/main" xmlns:pic="http://schemas.openxmlformats.org/drawingml/2006/picture">
             <wp:extent cx="5029200" cy="1786116"/>
-            <wp:docPr id="13" name="Picture 13"/>
+            <wp:docPr id="14" name="Picture 14"/>
             <wp:cNvGraphicFramePr>
               <a:graphicFrameLocks noChangeAspect="1"/>
             </wp:cNvGraphicFramePr>
@@ -10713,7 +10761,7 @@
                     <pic:cNvPicPr/>
                   </pic:nvPicPr>
                   <pic:blipFill>
-                    <a:blip r:embed="rId21"/>
+                    <a:blip r:embed="rId22"/>
                     <a:stretch>
                       <a:fillRect/>
                     </a:stretch>
@@ -10749,7 +10797,7 @@
         <w:drawing>
           <wp:inline xmlns:a="http://schemas.openxmlformats.org/drawingml/2006/main" xmlns:pic="http://schemas.openxmlformats.org/drawingml/2006/picture">
             <wp:extent cx="5029200" cy="1111956"/>
-            <wp:docPr id="14" name="Picture 14"/>
+            <wp:docPr id="15" name="Picture 15"/>
             <wp:cNvGraphicFramePr>
               <a:graphicFrameLocks noChangeAspect="1"/>
             </wp:cNvGraphicFramePr>
@@ -10761,7 +10809,7 @@
                     <pic:cNvPicPr/>
                   </pic:nvPicPr>
                   <pic:blipFill>
-                    <a:blip r:embed="rId22"/>
+                    <a:blip r:embed="rId23"/>
                     <a:stretch>
                       <a:fillRect/>
                     </a:stretch>
@@ -10868,7 +10916,7 @@
         <w:drawing>
           <wp:inline xmlns:a="http://schemas.openxmlformats.org/drawingml/2006/main" xmlns:pic="http://schemas.openxmlformats.org/drawingml/2006/picture">
             <wp:extent cx="5029200" cy="3391156"/>
-            <wp:docPr id="15" name="Picture 15"/>
+            <wp:docPr id="16" name="Picture 16"/>
             <wp:cNvGraphicFramePr>
               <a:graphicFrameLocks noChangeAspect="1"/>
             </wp:cNvGraphicFramePr>
@@ -10880,7 +10928,7 @@
                     <pic:cNvPicPr/>
                   </pic:nvPicPr>
                   <pic:blipFill>
-                    <a:blip r:embed="rId18"/>
+                    <a:blip r:embed="rId19"/>
                     <a:stretch>
                       <a:fillRect/>
                     </a:stretch>
@@ -11837,7 +11885,7 @@
         <w:drawing>
           <wp:inline xmlns:a="http://schemas.openxmlformats.org/drawingml/2006/main" xmlns:pic="http://schemas.openxmlformats.org/drawingml/2006/picture">
             <wp:extent cx="5029200" cy="3740974"/>
-            <wp:docPr id="16" name="Picture 16"/>
+            <wp:docPr id="17" name="Picture 17"/>
             <wp:cNvGraphicFramePr>
               <a:graphicFrameLocks noChangeAspect="1"/>
             </wp:cNvGraphicFramePr>
@@ -11849,7 +11897,7 @@
                     <pic:cNvPicPr/>
                   </pic:nvPicPr>
                   <pic:blipFill>
-                    <a:blip r:embed="rId23"/>
+                    <a:blip r:embed="rId24"/>
                     <a:stretch>
                       <a:fillRect/>
                     </a:stretch>
@@ -11885,7 +11933,7 @@
         <w:drawing>
           <wp:inline xmlns:a="http://schemas.openxmlformats.org/drawingml/2006/main" xmlns:pic="http://schemas.openxmlformats.org/drawingml/2006/picture">
             <wp:extent cx="5029200" cy="2509499"/>
-            <wp:docPr id="17" name="Picture 17"/>
+            <wp:docPr id="18" name="Picture 18"/>
             <wp:cNvGraphicFramePr>
               <a:graphicFrameLocks noChangeAspect="1"/>
             </wp:cNvGraphicFramePr>
@@ -11897,7 +11945,7 @@
                     <pic:cNvPicPr/>
                   </pic:nvPicPr>
                   <pic:blipFill>
-                    <a:blip r:embed="rId24"/>
+                    <a:blip r:embed="rId25"/>
                     <a:stretch>
                       <a:fillRect/>
                     </a:stretch>
@@ -11946,7 +11994,7 @@
         <w:drawing>
           <wp:inline xmlns:a="http://schemas.openxmlformats.org/drawingml/2006/main" xmlns:pic="http://schemas.openxmlformats.org/drawingml/2006/picture">
             <wp:extent cx="5029200" cy="1786116"/>
-            <wp:docPr id="18" name="Picture 18"/>
+            <wp:docPr id="19" name="Picture 19"/>
             <wp:cNvGraphicFramePr>
               <a:graphicFrameLocks noChangeAspect="1"/>
             </wp:cNvGraphicFramePr>
@@ -11958,7 +12006,7 @@
                     <pic:cNvPicPr/>
                   </pic:nvPicPr>
                   <pic:blipFill>
-                    <a:blip r:embed="rId21"/>
+                    <a:blip r:embed="rId22"/>
                     <a:stretch>
                       <a:fillRect/>
                     </a:stretch>
@@ -12009,7 +12057,7 @@
         <w:drawing>
           <wp:inline xmlns:a="http://schemas.openxmlformats.org/drawingml/2006/main" xmlns:pic="http://schemas.openxmlformats.org/drawingml/2006/picture">
             <wp:extent cx="5029200" cy="1111956"/>
-            <wp:docPr id="19" name="Picture 19"/>
+            <wp:docPr id="20" name="Picture 20"/>
             <wp:cNvGraphicFramePr>
               <a:graphicFrameLocks noChangeAspect="1"/>
             </wp:cNvGraphicFramePr>
@@ -12021,7 +12069,7 @@
                     <pic:cNvPicPr/>
                   </pic:nvPicPr>
                   <pic:blipFill>
-                    <a:blip r:embed="rId22"/>
+                    <a:blip r:embed="rId23"/>
                     <a:stretch>
                       <a:fillRect/>
                     </a:stretch>
@@ -12080,7 +12128,7 @@
         <w:drawing>
           <wp:inline xmlns:a="http://schemas.openxmlformats.org/drawingml/2006/main" xmlns:pic="http://schemas.openxmlformats.org/drawingml/2006/picture">
             <wp:extent cx="5029200" cy="1386459"/>
-            <wp:docPr id="20" name="Picture 20"/>
+            <wp:docPr id="21" name="Picture 21"/>
             <wp:cNvGraphicFramePr>
               <a:graphicFrameLocks noChangeAspect="1"/>
             </wp:cNvGraphicFramePr>
@@ -12092,7 +12140,7 @@
                     <pic:cNvPicPr/>
                   </pic:nvPicPr>
                   <pic:blipFill>
-                    <a:blip r:embed="rId25"/>
+                    <a:blip r:embed="rId26"/>
                     <a:stretch>
                       <a:fillRect/>
                     </a:stretch>
@@ -12542,7 +12590,7 @@
         <w:drawing>
           <wp:inline xmlns:a="http://schemas.openxmlformats.org/drawingml/2006/main" xmlns:pic="http://schemas.openxmlformats.org/drawingml/2006/picture">
             <wp:extent cx="5029200" cy="2980771"/>
-            <wp:docPr id="21" name="Picture 21"/>
+            <wp:docPr id="22" name="Picture 22"/>
             <wp:cNvGraphicFramePr>
               <a:graphicFrameLocks noChangeAspect="1"/>
             </wp:cNvGraphicFramePr>
@@ -12554,7 +12602,7 @@
                     <pic:cNvPicPr/>
                   </pic:nvPicPr>
                   <pic:blipFill>
-                    <a:blip r:embed="rId20"/>
+                    <a:blip r:embed="rId21"/>
                     <a:stretch>
                       <a:fillRect/>
                     </a:stretch>
@@ -12590,7 +12638,7 @@
         <w:drawing>
           <wp:inline xmlns:a="http://schemas.openxmlformats.org/drawingml/2006/main" xmlns:pic="http://schemas.openxmlformats.org/drawingml/2006/picture">
             <wp:extent cx="5029200" cy="2980771"/>
-            <wp:docPr id="22" name="Picture 22"/>
+            <wp:docPr id="23" name="Picture 23"/>
             <wp:cNvGraphicFramePr>
               <a:graphicFrameLocks noChangeAspect="1"/>
             </wp:cNvGraphicFramePr>
@@ -12602,7 +12650,7 @@
                     <pic:cNvPicPr/>
                   </pic:nvPicPr>
                   <pic:blipFill>
-                    <a:blip r:embed="rId26"/>
+                    <a:blip r:embed="rId27"/>
                     <a:stretch>
                       <a:fillRect/>
                     </a:stretch>
@@ -12638,7 +12686,7 @@
         <w:drawing>
           <wp:inline xmlns:a="http://schemas.openxmlformats.org/drawingml/2006/main" xmlns:pic="http://schemas.openxmlformats.org/drawingml/2006/picture">
             <wp:extent cx="5029200" cy="4006788"/>
-            <wp:docPr id="23" name="Picture 23"/>
+            <wp:docPr id="24" name="Picture 24"/>
             <wp:cNvGraphicFramePr>
               <a:graphicFrameLocks noChangeAspect="1"/>
             </wp:cNvGraphicFramePr>
@@ -12650,7 +12698,7 @@
                     <pic:cNvPicPr/>
                   </pic:nvPicPr>
                   <pic:blipFill>
-                    <a:blip r:embed="rId19"/>
+                    <a:blip r:embed="rId20"/>
                     <a:stretch>
                       <a:fillRect/>
                     </a:stretch>
@@ -12686,7 +12734,7 @@
         <w:drawing>
           <wp:inline xmlns:a="http://schemas.openxmlformats.org/drawingml/2006/main" xmlns:pic="http://schemas.openxmlformats.org/drawingml/2006/picture">
             <wp:extent cx="5029200" cy="4006788"/>
-            <wp:docPr id="24" name="Picture 24"/>
+            <wp:docPr id="25" name="Picture 25"/>
             <wp:cNvGraphicFramePr>
               <a:graphicFrameLocks noChangeAspect="1"/>
             </wp:cNvGraphicFramePr>
@@ -12698,7 +12746,7 @@
                     <pic:cNvPicPr/>
                   </pic:nvPicPr>
                   <pic:blipFill>
-                    <a:blip r:embed="rId27"/>
+                    <a:blip r:embed="rId28"/>
                     <a:stretch>
                       <a:fillRect/>
                     </a:stretch>
@@ -12734,7 +12782,7 @@
         <w:drawing>
           <wp:inline xmlns:a="http://schemas.openxmlformats.org/drawingml/2006/main" xmlns:pic="http://schemas.openxmlformats.org/drawingml/2006/picture">
             <wp:extent cx="5029200" cy="4899994"/>
-            <wp:docPr id="25" name="Picture 25"/>
+            <wp:docPr id="26" name="Picture 26"/>
             <wp:cNvGraphicFramePr>
               <a:graphicFrameLocks noChangeAspect="1"/>
             </wp:cNvGraphicFramePr>
@@ -12746,7 +12794,7 @@
                     <pic:cNvPicPr/>
                   </pic:nvPicPr>
                   <pic:blipFill>
-                    <a:blip r:embed="rId28"/>
+                    <a:blip r:embed="rId29"/>
                     <a:stretch>
                       <a:fillRect/>
                     </a:stretch>

</xml_diff>

<commit_message>
feat: add total_setup_time, fix figures, convergence tracking
- evaluator: expose total_setup_time (hours) in results dict
- ga_env: track per-step best fitness for hybrid convergence plot
- instance_generator: 10 configs (3x3 + stress), PROC_TIME=8.0
- visualisation: plot_gantt accepts machine= param for zoom
- experiments: all runners include total_setup_time in output
- notebooks: rewrite 06 (single Gantt seed=27, convergence plot)
- notebook 05: fix setup_cost_makespan y-axis label, figsize
- figures: cut 11 redundant, keep 15 referenced in notes
- notes: fix broken figure refs across all chapters
- tests: 45 passing
</commit_message>
<xml_diff>
--- a/notes/dissertation_draft.docx
+++ b/notes/dissertation_draft.docx
@@ -60,7 +60,7 @@
       <w:r>
         <w:drawing>
           <wp:inline xmlns:a="http://schemas.openxmlformats.org/drawingml/2006/main" xmlns:pic="http://schemas.openxmlformats.org/drawingml/2006/picture">
-            <wp:extent cx="5029200" cy="3741234"/>
+            <wp:extent cx="5029200" cy="3739119"/>
             <wp:docPr id="1" name="Picture 1"/>
             <wp:cNvGraphicFramePr>
               <a:graphicFrameLocks noChangeAspect="1"/>
@@ -81,7 +81,7 @@
                   <pic:spPr>
                     <a:xfrm>
                       <a:off x="0" y="0"/>
-                      <a:ext cx="5029200" cy="3741234"/>
+                      <a:ext cx="5029200" cy="3739119"/>
                     </a:xfrm>
                     <a:prstGeom prst="rect"/>
                   </pic:spPr>
@@ -108,7 +108,7 @@
       <w:r>
         <w:drawing>
           <wp:inline xmlns:a="http://schemas.openxmlformats.org/drawingml/2006/main" xmlns:pic="http://schemas.openxmlformats.org/drawingml/2006/picture">
-            <wp:extent cx="5029200" cy="3737004"/>
+            <wp:extent cx="5029200" cy="3707383"/>
             <wp:docPr id="2" name="Picture 2"/>
             <wp:cNvGraphicFramePr>
               <a:graphicFrameLocks noChangeAspect="1"/>
@@ -129,7 +129,7 @@
                   <pic:spPr>
                     <a:xfrm>
                       <a:off x="0" y="0"/>
-                      <a:ext cx="5029200" cy="3737004"/>
+                      <a:ext cx="5029200" cy="3707383"/>
                     </a:xfrm>
                     <a:prstGeom prst="rect"/>
                   </pic:spPr>
@@ -156,7 +156,7 @@
       <w:r>
         <w:drawing>
           <wp:inline xmlns:a="http://schemas.openxmlformats.org/drawingml/2006/main" xmlns:pic="http://schemas.openxmlformats.org/drawingml/2006/picture">
-            <wp:extent cx="5029200" cy="4106804"/>
+            <wp:extent cx="5029200" cy="4130886"/>
             <wp:docPr id="3" name="Picture 3"/>
             <wp:cNvGraphicFramePr>
               <a:graphicFrameLocks noChangeAspect="1"/>
@@ -177,7 +177,7 @@
                   <pic:spPr>
                     <a:xfrm>
                       <a:off x="0" y="0"/>
-                      <a:ext cx="5029200" cy="4106804"/>
+                      <a:ext cx="5029200" cy="4130886"/>
                     </a:xfrm>
                     <a:prstGeom prst="rect"/>
                   </pic:spPr>
@@ -204,7 +204,7 @@
       <w:r>
         <w:drawing>
           <wp:inline xmlns:a="http://schemas.openxmlformats.org/drawingml/2006/main" xmlns:pic="http://schemas.openxmlformats.org/drawingml/2006/picture">
-            <wp:extent cx="5029200" cy="3716686"/>
+            <wp:extent cx="5029200" cy="3707383"/>
             <wp:docPr id="4" name="Picture 4"/>
             <wp:cNvGraphicFramePr>
               <a:graphicFrameLocks noChangeAspect="1"/>
@@ -225,7 +225,7 @@
                   <pic:spPr>
                     <a:xfrm>
                       <a:off x="0" y="0"/>
-                      <a:ext cx="5029200" cy="3716686"/>
+                      <a:ext cx="5029200" cy="3707383"/>
                     </a:xfrm>
                     <a:prstGeom prst="rect"/>
                   </pic:spPr>
@@ -252,7 +252,7 @@
       <w:r>
         <w:drawing>
           <wp:inline xmlns:a="http://schemas.openxmlformats.org/drawingml/2006/main" xmlns:pic="http://schemas.openxmlformats.org/drawingml/2006/picture">
-            <wp:extent cx="5029200" cy="3735434"/>
+            <wp:extent cx="5029200" cy="3733864"/>
             <wp:docPr id="5" name="Picture 5"/>
             <wp:cNvGraphicFramePr>
               <a:graphicFrameLocks noChangeAspect="1"/>
@@ -273,7 +273,7 @@
                   <pic:spPr>
                     <a:xfrm>
                       <a:off x="0" y="0"/>
-                      <a:ext cx="5029200" cy="3735434"/>
+                      <a:ext cx="5029200" cy="3733864"/>
                     </a:xfrm>
                     <a:prstGeom prst="rect"/>
                   </pic:spPr>
@@ -1246,7 +1246,7 @@
       <w:r>
         <w:drawing>
           <wp:inline xmlns:a="http://schemas.openxmlformats.org/drawingml/2006/main" xmlns:pic="http://schemas.openxmlformats.org/drawingml/2006/picture">
-            <wp:extent cx="5029200" cy="1324363"/>
+            <wp:extent cx="5029200" cy="1328587"/>
             <wp:docPr id="7" name="Picture 7"/>
             <wp:cNvGraphicFramePr>
               <a:graphicFrameLocks noChangeAspect="1"/>
@@ -1267,7 +1267,7 @@
                   <pic:spPr>
                     <a:xfrm>
                       <a:off x="0" y="0"/>
-                      <a:ext cx="5029200" cy="1324363"/>
+                      <a:ext cx="5029200" cy="1328587"/>
                     </a:xfrm>
                     <a:prstGeom prst="rect"/>
                   </pic:spPr>
@@ -4208,7 +4208,7 @@
       <w:r>
         <w:drawing>
           <wp:inline xmlns:a="http://schemas.openxmlformats.org/drawingml/2006/main" xmlns:pic="http://schemas.openxmlformats.org/drawingml/2006/picture">
-            <wp:extent cx="5029200" cy="1623550"/>
+            <wp:extent cx="5029200" cy="1622868"/>
             <wp:docPr id="8" name="Picture 8"/>
             <wp:cNvGraphicFramePr>
               <a:graphicFrameLocks noChangeAspect="1"/>
@@ -4229,7 +4229,7 @@
                   <pic:spPr>
                     <a:xfrm>
                       <a:off x="0" y="0"/>
-                      <a:ext cx="5029200" cy="1623550"/>
+                      <a:ext cx="5029200" cy="1622868"/>
                     </a:xfrm>
                     <a:prstGeom prst="rect"/>
                   </pic:spPr>
@@ -4256,7 +4256,7 @@
       <w:r>
         <w:drawing>
           <wp:inline xmlns:a="http://schemas.openxmlformats.org/drawingml/2006/main" xmlns:pic="http://schemas.openxmlformats.org/drawingml/2006/picture">
-            <wp:extent cx="5029200" cy="3199999"/>
+            <wp:extent cx="5029200" cy="3144874"/>
             <wp:docPr id="9" name="Picture 9"/>
             <wp:cNvGraphicFramePr>
               <a:graphicFrameLocks noChangeAspect="1"/>
@@ -4277,7 +4277,7 @@
                   <pic:spPr>
                     <a:xfrm>
                       <a:off x="0" y="0"/>
-                      <a:ext cx="5029200" cy="3199999"/>
+                      <a:ext cx="5029200" cy="3144874"/>
                     </a:xfrm>
                     <a:prstGeom prst="rect"/>
                   </pic:spPr>
@@ -9120,7 +9120,7 @@
       <w:r>
         <w:drawing>
           <wp:inline xmlns:a="http://schemas.openxmlformats.org/drawingml/2006/main" xmlns:pic="http://schemas.openxmlformats.org/drawingml/2006/picture">
-            <wp:extent cx="5029200" cy="2050714"/>
+            <wp:extent cx="5029200" cy="2049038"/>
             <wp:docPr id="10" name="Picture 10"/>
             <wp:cNvGraphicFramePr>
               <a:graphicFrameLocks noChangeAspect="1"/>
@@ -9129,7 +9129,7 @@
               <a:graphicData uri="http://schemas.openxmlformats.org/drawingml/2006/picture">
                 <pic:pic>
                   <pic:nvPicPr>
-                    <pic:cNvPr id="0" name="05_improvement_bars.png"/>
+                    <pic:cNvPr id="0" name="06_improvement_bars.png"/>
                     <pic:cNvPicPr/>
                   </pic:nvPicPr>
                   <pic:blipFill>
@@ -9141,7 +9141,7 @@
                   <pic:spPr>
                     <a:xfrm>
                       <a:off x="0" y="0"/>
-                      <a:ext cx="5029200" cy="2050714"/>
+                      <a:ext cx="5029200" cy="2049038"/>
                     </a:xfrm>
                     <a:prstGeom prst="rect"/>
                   </pic:spPr>
@@ -10652,7 +10652,7 @@
       <w:r>
         <w:drawing>
           <wp:inline xmlns:a="http://schemas.openxmlformats.org/drawingml/2006/main" xmlns:pic="http://schemas.openxmlformats.org/drawingml/2006/picture">
-            <wp:extent cx="5029200" cy="4006788"/>
+            <wp:extent cx="5029200" cy="4009597"/>
             <wp:docPr id="12" name="Picture 12"/>
             <wp:cNvGraphicFramePr>
               <a:graphicFrameLocks noChangeAspect="1"/>
@@ -10661,7 +10661,7 @@
               <a:graphicData uri="http://schemas.openxmlformats.org/drawingml/2006/picture">
                 <pic:pic>
                   <pic:nvPicPr>
-                    <pic:cNvPr id="0" name="06_gantt_comparison.png"/>
+                    <pic:cNvPr id="0" name="06_gantt_j20_m5.png"/>
                     <pic:cNvPicPr/>
                   </pic:nvPicPr>
                   <pic:blipFill>
@@ -10673,7 +10673,7 @@
                   <pic:spPr>
                     <a:xfrm>
                       <a:off x="0" y="0"/>
-                      <a:ext cx="5029200" cy="4006788"/>
+                      <a:ext cx="5029200" cy="4009597"/>
                     </a:xfrm>
                     <a:prstGeom prst="rect"/>
                   </pic:spPr>
@@ -10709,7 +10709,7 @@
               <a:graphicData uri="http://schemas.openxmlformats.org/drawingml/2006/picture">
                 <pic:pic>
                   <pic:nvPicPr>
-                    <pic:cNvPr id="0" name="06_convergence.png"/>
+                    <pic:cNvPr id="0" name="06_convergence_j20_m5.png"/>
                     <pic:cNvPicPr/>
                   </pic:nvPicPr>
                   <pic:blipFill>
@@ -11882,9 +11882,26 @@
     </w:p>
     <w:p>
       <w:r>
+        <w:t>[Missing: ../figures/05_scatter_tardiness_setup.png]</w:t>
+      </w:r>
+    </w:p>
+    <w:p>
+      <w:pPr>
+        <w:jc w:val="center"/>
+      </w:pPr>
+      <w:r>
+        <w:rPr>
+          <w:i/>
+          <w:sz w:val="18"/>
+        </w:rPr>
+        <w:t>Figure 5.5: Scatter plot of weighted tardiness versus setup cost for GA (blue) and Hybrid (orange) on n50_m1 (50 seeds each, lower is better — closer to origin). GA solutions scatter across weighted tardiness 218–1395 and setup cost 234–544. Hybrid clusters tightly at tardiness 308–864 and setup cost 131–271.</w:t>
+      </w:r>
+    </w:p>
+    <w:p>
+      <w:r>
         <w:drawing>
           <wp:inline xmlns:a="http://schemas.openxmlformats.org/drawingml/2006/main" xmlns:pic="http://schemas.openxmlformats.org/drawingml/2006/picture">
-            <wp:extent cx="5029200" cy="3740974"/>
+            <wp:extent cx="5029200" cy="2507804"/>
             <wp:docPr id="17" name="Picture 17"/>
             <wp:cNvGraphicFramePr>
               <a:graphicFrameLocks noChangeAspect="1"/>
@@ -11893,7 +11910,7 @@
               <a:graphicData uri="http://schemas.openxmlformats.org/drawingml/2006/picture">
                 <pic:pic>
                   <pic:nvPicPr>
-                    <pic:cNvPr id="0" name="05_scatter_tardiness_setup.png"/>
+                    <pic:cNvPr id="0" name="05_sensitivity_alpha.png"/>
                     <pic:cNvPicPr/>
                   </pic:nvPicPr>
                   <pic:blipFill>
@@ -11905,7 +11922,7 @@
                   <pic:spPr>
                     <a:xfrm>
                       <a:off x="0" y="0"/>
-                      <a:ext cx="5029200" cy="3740974"/>
+                      <a:ext cx="5029200" cy="2507804"/>
                     </a:xfrm>
                     <a:prstGeom prst="rect"/>
                   </pic:spPr>
@@ -11925,54 +11942,6 @@
           <w:i/>
           <w:sz w:val="18"/>
         </w:rPr>
-        <w:t>Figure 5.5: Scatter plot of weighted tardiness versus setup cost for GA (blue) and Hybrid (orange) on n50_m1 (50 seeds each, lower is better — closer to origin). GA solutions scatter across weighted tardiness 218–1395 and setup cost 234–544. Hybrid clusters tightly at tardiness 308–864 and setup cost 131–271.</w:t>
-      </w:r>
-    </w:p>
-    <w:p>
-      <w:r>
-        <w:drawing>
-          <wp:inline xmlns:a="http://schemas.openxmlformats.org/drawingml/2006/main" xmlns:pic="http://schemas.openxmlformats.org/drawingml/2006/picture">
-            <wp:extent cx="5029200" cy="2509499"/>
-            <wp:docPr id="18" name="Picture 18"/>
-            <wp:cNvGraphicFramePr>
-              <a:graphicFrameLocks noChangeAspect="1"/>
-            </wp:cNvGraphicFramePr>
-            <a:graphic>
-              <a:graphicData uri="http://schemas.openxmlformats.org/drawingml/2006/picture">
-                <pic:pic>
-                  <pic:nvPicPr>
-                    <pic:cNvPr id="0" name="05_sensitivity_alpha.png"/>
-                    <pic:cNvPicPr/>
-                  </pic:nvPicPr>
-                  <pic:blipFill>
-                    <a:blip r:embed="rId25"/>
-                    <a:stretch>
-                      <a:fillRect/>
-                    </a:stretch>
-                  </pic:blipFill>
-                  <pic:spPr>
-                    <a:xfrm>
-                      <a:off x="0" y="0"/>
-                      <a:ext cx="5029200" cy="2509499"/>
-                    </a:xfrm>
-                    <a:prstGeom prst="rect"/>
-                  </pic:spPr>
-                </pic:pic>
-              </a:graphicData>
-            </a:graphic>
-          </wp:inline>
-        </w:drawing>
-      </w:r>
-    </w:p>
-    <w:p>
-      <w:pPr>
-        <w:jc w:val="center"/>
-      </w:pPr>
-      <w:r>
-        <w:rPr>
-          <w:i/>
-          <w:sz w:val="18"/>
-        </w:rPr>
         <w:t>Figure 5.2: Sensitivity analysis across alpha values of 0.3, 0.5, and 0.7 (lower is better). The hybrid advantage is consistent across all three weightings.</w:t>
       </w:r>
     </w:p>
@@ -11994,7 +11963,7 @@
         <w:drawing>
           <wp:inline xmlns:a="http://schemas.openxmlformats.org/drawingml/2006/main" xmlns:pic="http://schemas.openxmlformats.org/drawingml/2006/picture">
             <wp:extent cx="5029200" cy="1786116"/>
-            <wp:docPr id="19" name="Picture 19"/>
+            <wp:docPr id="18" name="Picture 18"/>
             <wp:cNvGraphicFramePr>
               <a:graphicFrameLocks noChangeAspect="1"/>
             </wp:cNvGraphicFramePr>
@@ -12057,7 +12026,7 @@
         <w:drawing>
           <wp:inline xmlns:a="http://schemas.openxmlformats.org/drawingml/2006/main" xmlns:pic="http://schemas.openxmlformats.org/drawingml/2006/picture">
             <wp:extent cx="5029200" cy="1111956"/>
-            <wp:docPr id="20" name="Picture 20"/>
+            <wp:docPr id="19" name="Picture 19"/>
             <wp:cNvGraphicFramePr>
               <a:graphicFrameLocks noChangeAspect="1"/>
             </wp:cNvGraphicFramePr>
@@ -12125,10 +12094,441 @@
     </w:p>
     <w:p>
       <w:r>
+        <w:t>[Missing: ../figures/05_nn_greedy_failures.png]</w:t>
+      </w:r>
+    </w:p>
+    <w:p>
+      <w:pPr>
+        <w:jc w:val="center"/>
+      </w:pPr>
+      <w:r>
+        <w:rPr>
+          <w:i/>
+          <w:sz w:val="18"/>
+        </w:rPr>
+        <w:t>Figure 5.6: Mean and worst-case composite scores for NN-Greedy, GA, and Hybrid across four large instance configurations (lower is better). On n50_m5, NN-Greedy worst-case composite is 2.6× the Hybrid mean. GA and Hybrid worst cases remain within 1.5× their respective means (lower is better).</w:t>
+      </w:r>
+    </w:p>
+    <w:p>
+      <w:pPr>
+        <w:pStyle w:val="Heading1"/>
+      </w:pPr>
+      <w:r>
+        <w:t>5.5 Practical Implications</w:t>
+      </w:r>
+    </w:p>
+    <w:p>
+      <w:r>
+        <w:t>The results have several practical implications for textile dyeing scheduling.</w:t>
+      </w:r>
+    </w:p>
+    <w:p>
+      <w:r>
+        <w:rPr>
+          <w:b/>
+        </w:rPr>
+        <w:t>Cost savings.</w:t>
+      </w:r>
+      <w:r>
+        <w:t xml:space="preserve"> The 34-42% improvement in composite cost on large single-machine instances translates directly to reduced manufacturing costs. In textile dyeing, setup costs represent the chemicals, water, and time required to change colour between batches. A 35% reduction in setup cost on a large production run could save thousands of pounds per week in chemical costs alone, while also reducing water consumption and wastewater treatment requirements.</w:t>
+      </w:r>
+    </w:p>
+    <w:p>
+      <w:r>
+        <w:rPr>
+          <w:b/>
+        </w:rPr>
+        <w:t>Robustness.</w:t>
+      </w:r>
+      <w:r>
+        <w:t xml:space="preserve"> The hybrid approach never produces catastrophic solutions, unlike NN-Greedy. In a real manufacturing environment, schedule quality consistency is critical: a single poor schedule can disrupt downstream processes, miss customer delivery windows, and incur penalty costs. The GA's population-based evaluation naturally filters out poor solutions, and the PPO agent's adaptive mutation further improves worst-case performance.</w:t>
+      </w:r>
+    </w:p>
+    <w:p>
+      <w:r>
+        <w:rPr>
+          <w:b/>
+        </w:rPr>
+        <w:t>Scalability.</w:t>
+      </w:r>
+      <w:r>
+        <w:t xml:space="preserve"> The hybrid advantage increases with problem size, suggesting that the approach becomes more valuable as manufacturing operations scale. Small shops with few jobs may not benefit significantly from the hyper-heuristic, but medium and large operations with 50+ jobs per production run would see meaningful cost reductions.</w:t>
+      </w:r>
+    </w:p>
+    <w:p>
+      <w:r>
+        <w:rPr>
+          <w:b/>
+        </w:rPr>
+        <w:t>Computational cost.</w:t>
+      </w:r>
+      <w:r>
+        <w:t xml:space="preserve"> The hybrid approach requires training the PPO model (approximately 45 minutes) and then executing the GA with the agent's policy. The evaluation GA runs take approximately 2-3 minutes per instance on a modern CPU, compared to under 1 second for NN-Greedy. For offline scheduling (planning production runs a day or two in advance), this computational cost is negligible. For real-time rescheduling in response to machine breakdowns or rush orders, the heuristic baselines may be preferred despite their lower solution quality.</w:t>
+      </w:r>
+    </w:p>
+    <w:p>
+      <w:pPr>
+        <w:pStyle w:val="Heading1"/>
+      </w:pPr>
+      <w:r>
+        <w:t>5.6 Limitations</w:t>
+      </w:r>
+    </w:p>
+    <w:p>
+      <w:r>
+        <w:t>Several limitations of this study should be acknowledged.</w:t>
+      </w:r>
+    </w:p>
+    <w:p>
+      <w:r>
+        <w:rPr>
+          <w:b/>
+        </w:rPr>
+        <w:t>Generalisability to different cost structures.</w:t>
+      </w:r>
+      <w:r>
+        <w:t xml:space="preserve"> The instance generator uses a specific colour-based cost structure motivated by textile dyeing. The generalisation to problem domains with fundamentally different cost structures — such as spatial distance costs or random asymmetry — remains an open question.</w:t>
+      </w:r>
+    </w:p>
+    <w:p>
+      <w:r>
+        <w:rPr>
+          <w:b/>
+        </w:rPr>
+        <w:t>Generalisability to larger instances.</w:t>
+      </w:r>
+      <w:r>
+        <w:t xml:space="preserve"> The PPO agent was trained on instances ranging from n = 10 to n = 500. While this includes extra-large configurations, the generalisation to instances beyond n = 500 has not been tested. It is possible that the policy learned on n = 500 instances would not transfer effectively to n = 1000 or larger problems due to different convergence dynamics at larger scales.</w:t>
+      </w:r>
+    </w:p>
+    <w:p>
+      <w:r>
+        <w:rPr>
+          <w:b/>
+        </w:rPr>
+        <w:t>Observation space completeness.</w:t>
+      </w:r>
+      <w:r>
+        <w:t xml:space="preserve"> The environment exposes only eight observation features to the agent. A richer observation space could include per-machine statistics (load balance, completion times), colour distribution entropy, or historical action effectiveness. Such features might enable the agent to learn a more sophisticated policy with finer-grained control.</w:t>
+      </w:r>
+    </w:p>
+    <w:p>
+      <w:r>
+        <w:rPr>
+          <w:b/>
+        </w:rPr>
+        <w:t>Single DRL algorithm.</w:t>
+      </w:r>
+      <w:r>
+        <w:t xml:space="preserve"> Only PPO was evaluated. Alternative DRL algorithms such as Advantage Actor-Critic (A2C), Soft Actor-Critic (SAC), or Deep Q-Networks (DQN) might achieve different performance levels or exhibit different training dynamics. PPO was chosen for its stability and ease of use, but a systematic comparison of DRL algorithms for this environment could yield additional insights.</w:t>
+      </w:r>
+    </w:p>
+    <w:p>
+      <w:r>
+        <w:rPr>
+          <w:b/>
+        </w:rPr>
+        <w:t>Synthetic data only.</w:t>
+      </w:r>
+      <w:r>
+        <w:t xml:space="preserve"> All experiments used synthetically generated instances with colour-based cost structure. While this provides a clean experimental framework with known ground truth, real manufacturing data may exhibit different cost distributions, due-date structures, and machine constraints. Validation on real factory data would strengthen claims about practical applicability.</w:t>
+      </w:r>
+    </w:p>
+    <w:p>
+      <w:r>
+        <w:rPr>
+          <w:b/>
+        </w:rPr>
+        <w:t>Baseline scope.</w:t>
+      </w:r>
+      <w:r>
+        <w:t xml:space="preserve"> The comparison includes two classical heuristics (SPT and NN-Greedy) and a fixed-mutation GA. More sophisticated scheduling methods such as the NEH heuristic, Ant Colony Optimisation, or Tabu Search were not implemented. The hybrid approach may not outperform all of these on all configurations.</w:t>
+      </w:r>
+    </w:p>
+    <w:p>
+      <w:r>
+        <w:rPr>
+          <w:b/>
+        </w:rPr>
+        <w:t>Training budget.</w:t>
+      </w:r>
+      <w:r>
+        <w:t xml:space="preserve"> The PPO agent was trained for 100,000 timesteps with a reduced population size of 25 and reduced generation count of 100. A longer training budget with the full evaluation parameters might yield a more effective policy. However, the training time increases proportionally, and the current budget was chosen as a pragmatic compromise between policy quality and computational cost.</w:t>
+      </w:r>
+    </w:p>
+    <w:p>
+      <w:pPr>
+        <w:pStyle w:val="Heading1"/>
+      </w:pPr>
+      <w:r>
+        <w:t>5.7 Threats to Validity</w:t>
+      </w:r>
+    </w:p>
+    <w:p>
+      <w:r>
+        <w:rPr>
+          <w:b/>
+        </w:rPr>
+        <w:t>Internal validity.</w:t>
+      </w:r>
+      <w:r>
+        <w:t xml:space="preserve"> DEAP's global state management is a known concern. The implementation addresses this through </w:t>
+      </w:r>
+      <w:r>
+        <w:rPr>
+          <w:rFonts w:ascii="Courier New" w:hAnsi="Courier New"/>
+          <w:sz w:val="18"/>
+        </w:rPr>
+        <w:t>hasattr</w:t>
+      </w:r>
+      <w:r>
+        <w:t xml:space="preserve"> guards in the </w:t>
+      </w:r>
+      <w:r>
+        <w:rPr>
+          <w:rFonts w:ascii="Courier New" w:hAnsi="Courier New"/>
+          <w:sz w:val="18"/>
+        </w:rPr>
+        <w:t>build_toolbox</w:t>
+      </w:r>
+      <w:r>
+        <w:t xml:space="preserve"> function and the use of </w:t>
+      </w:r>
+      <w:r>
+        <w:rPr>
+          <w:rFonts w:ascii="Courier New" w:hAnsi="Courier New"/>
+          <w:sz w:val="18"/>
+        </w:rPr>
+        <w:t>get_context("spawn")</w:t>
+      </w:r>
+      <w:r>
+        <w:t xml:space="preserve"> for multiprocessing. Each worker process re-imports the module and re-registers DEAP types independently, preventing cross-process state contamination. However, within a single process (e.g., running the GA environment in a notebook), repeated calls to </w:t>
+      </w:r>
+      <w:r>
+        <w:rPr>
+          <w:rFonts w:ascii="Courier New" w:hAnsi="Courier New"/>
+          <w:sz w:val="18"/>
+        </w:rPr>
+        <w:t>build_toolbox</w:t>
+      </w:r>
+      <w:r>
+        <w:t xml:space="preserve"> could interact with DEAP's creator registry if the </w:t>
+      </w:r>
+      <w:r>
+        <w:rPr>
+          <w:rFonts w:ascii="Courier New" w:hAnsi="Courier New"/>
+          <w:sz w:val="18"/>
+        </w:rPr>
+        <w:t>hasattr</w:t>
+      </w:r>
+      <w:r>
+        <w:t xml:space="preserve"> guards fail for any reason.</w:t>
+      </w:r>
+    </w:p>
+    <w:p>
+      <w:r>
+        <w:rPr>
+          <w:b/>
+        </w:rPr>
+        <w:t>External validity.</w:t>
+      </w:r>
+      <w:r>
+        <w:t xml:space="preserve"> The results may not transfer to different problem domains with different cost structures. The colour-based asymmetry in this study produces a specific pattern of setup costs (dark-to-light transitions are consistently expensive). Problems with different cost structures — such as random asymmetry or distance-based costs — might favour different mutation strategies. The robustness of the hybrid approach across cost structures remains an open question.</w:t>
+      </w:r>
+    </w:p>
+    <w:p>
+      <w:r>
+        <w:rPr>
+          <w:b/>
+        </w:rPr>
+        <w:t>Construct validity.</w:t>
+      </w:r>
+      <w:r>
+        <w:t xml:space="preserve"> The composite objective with alpha = 0.5 represents a specific trade-off between tardiness and setup cost. While the sensitivity analysis shows that results are stable across alpha values, the choice of alpha remains somewhat arbitrary. A more thorough approach would treat this as a multi-objective optimisation problem and compare Pareto fronts. The significance of the results relative to this concern is somewhat mitigated by the sensitivity analysis, which confirms the pattern holds across the tested range. Additionally, the normalisation procedure using empirically sampled scales introduces a dependence on the specific schedules used for estimation, though this dependence is consistent across all algorithms compared on the same instance.</w:t>
+      </w:r>
+    </w:p>
+    <w:p>
+      <w:r>
+        <w:rPr>
+          <w:b/>
+        </w:rPr>
+        <w:t>Statistical conclusion validity.</w:t>
+      </w:r>
+      <w:r>
+        <w:t xml:space="preserve"> The Wilcoxon signed-rank test is appropriate for the paired experimental design and does not assume normality. The sample size of 50 is adequate for this test. However, the use of multiple comparisons (eight configurations, multiple baseline comparisons) inflates the family-wise error rate. However, the hybrid vs GA comparisons on large instances (p &lt; 0.001) survive even conservative Bonferroni corrections.</w:t>
+      </w:r>
+    </w:p>
+    <w:p>
+      <w:pPr>
+        <w:pStyle w:val="Title"/>
+      </w:pPr>
+      <w:r>
+        <w:t>Chapter 6. Conclusions and Future Work</w:t>
+      </w:r>
+    </w:p>
+    <w:p>
+      <w:pPr>
+        <w:pStyle w:val="Heading1"/>
+      </w:pPr>
+      <w:r>
+        <w:t>6.1 Summary of Contributions</w:t>
+      </w:r>
+    </w:p>
+    <w:p>
+      <w:r>
+        <w:t>This project investigated a hybrid approach combining Genetic Algorithms with Deep Reinforcement Learning for solving the parallel machine scheduling problem with asymmetric, sequence-dependent setup costs. The core idea was to train a Proximal Policy Optimisation agent as a hyper-heuristic that controls both the GA mutation operator and the tournament-selection size, replacing the fixed parameterisation of a standalone GA with an adaptive policy that responds to the population's convergence state.</w:t>
+      </w:r>
+    </w:p>
+    <w:p>
+      <w:r>
+        <w:t>The primary contributions of this work are:</w:t>
+      </w:r>
+    </w:p>
+    <w:p>
+      <w:pPr>
+        <w:pStyle w:val="ListNumber"/>
+      </w:pPr>
+      <w:r>
+        <w:rPr>
+          <w:b/>
+        </w:rPr>
+        <w:t>Problem formalisation.</w:t>
+      </w:r>
+      <w:r>
+        <w:t xml:space="preserve"> The PMSP-SDSC problem with colour-based asymmetric cost structure was formalised, including a synthetic instance generator with weekly capacity calibration, setup-time-to-processing-time ratio of 1/8, and reproducible seeding. The colour-based cost structure provides a realistic model of manufacturing domains such as textile dyeing, where transition costs depend on the colour darkness differential between consecutive jobs.</w:t>
+      </w:r>
+    </w:p>
+    <w:p>
+      <w:pPr>
+        <w:pStyle w:val="ListNumber"/>
+      </w:pPr>
+      <w:r>
+        <w:rPr>
+          <w:b/>
+        </w:rPr>
+        <w:t>Environment design.</w:t>
+      </w:r>
+      <w:r>
+        <w:t xml:space="preserve"> A Gymnasium environment was designed to wrap the GA execution loop, exposing an 11-dimensional continuous observation space covering fitness progress, population convergence, diversity, stagnation, problem scale, cost structure, and the previous action. A 6-action discrete space controls both the mutation operator (swap, inversion, insertion) and the tournament-selection size. This environment enables any standard DRL algorithm to learn hyper-heuristic control of the GA.</w:t>
+      </w:r>
+    </w:p>
+    <w:p>
+      <w:pPr>
+        <w:pStyle w:val="ListNumber"/>
+      </w:pPr>
+      <w:r>
+        <w:rPr>
+          <w:b/>
+        </w:rPr>
+        <w:t>Empirical demonstration.</w:t>
+      </w:r>
+      <w:r>
+        <w:t xml:space="preserve"> Through experiments across a 3×3 configuration grid (easy/tight/overloaded × 1/3/5 machines, 50 seeds each), the hybrid approach was shown to outperform standalone GA on the realistic multi-machine configurations. On the tight configurations the hybrid achieved up to 30% mean improvement over GA (j20_m5: +29.9%), with the advantage concentrated on multi-machine workloads where adaptive mutation matters most.</w:t>
+      </w:r>
+    </w:p>
+    <w:p>
+      <w:pPr>
+        <w:pStyle w:val="ListNumber"/>
+      </w:pPr>
+      <w:r>
+        <w:rPr>
+          <w:b/>
+        </w:rPr>
+        <w:t>Scalability.</w:t>
+      </w:r>
+      <w:r>
+        <w:t xml:space="preserve"> The hybrid advantage is largest on constrained multi-machine instances. On tight/overloaded 3- and 5-machine configurations (j21_m3, j20_m5, j30_m5) the hybrid consistently beats GA on 90-100% of seeds, demonstrating that the hyper-heuristic becomes more valuable as the search space grows and the GA's fixed parameterisation becomes more constraining.</w:t>
+      </w:r>
+    </w:p>
+    <w:p>
+      <w:pPr>
+        <w:pStyle w:val="ListNumber"/>
+      </w:pPr>
+      <w:r>
+        <w:rPr>
+          <w:b/>
+        </w:rPr>
+        <w:t>Behavioural insight.</w:t>
+      </w:r>
+      <w:r>
+        <w:t xml:space="preserve"> The action frequency analysis revealed that the PPO agent learns a meaningful and interpretable policy: it applies high-disruption insertion mutation during early generations and transitions to moderate-disruption inversion mutation as the population converges, adapting its disruption level to the search stage. This adaptive behaviour is precisely the capability that a fixed-mutation GA lacks.</w:t>
+      </w:r>
+    </w:p>
+    <w:p>
+      <w:pPr>
+        <w:pStyle w:val="Heading1"/>
+      </w:pPr>
+      <w:r>
+        <w:t>6.2 Key Findings</w:t>
+      </w:r>
+    </w:p>
+    <w:p>
+      <w:r>
+        <w:t>The following key findings emerge from this study:</w:t>
+      </w:r>
+    </w:p>
+    <w:p>
+      <w:pPr>
+        <w:pStyle w:val="ListNumber"/>
+      </w:pPr>
+      <w:r>
+        <w:rPr>
+          <w:b/>
+        </w:rPr>
+        <w:t>The hybrid approach significantly outperforms standalone GA on constrained multi-machine instances.</w:t>
+      </w:r>
+      <w:r>
+        <w:t xml:space="preserve"> On j20_m5 (n = 100, m = 5, 95% utilisation), the hybrid achieved composite scores 29.9% lower than GA on average and beat GA on 100% of seeds. On j21_m3 (n = 63, m = 3, 100% utilisation) the improvement is 24.4%.</w:t>
+      </w:r>
+    </w:p>
+    <w:p>
+      <w:pPr>
+        <w:pStyle w:val="ListNumber"/>
+      </w:pPr>
+      <w:r>
+        <w:rPr>
+          <w:b/>
+        </w:rPr>
+        <w:t>The performance gap is concentrated where the GA is stretched.</w:t>
+      </w:r>
+      <w:r>
+        <w:t xml:space="preserve"> On easy single-machine configurations (j10_m1, j20_m1, j30_m1) GA and Hybrid are effectively equivalent (≤ 2%), because the GA's fixed parameterisation is already adequate when the load is light. On tight and overloaded multi-machine configurations the gap is substantial. This suggests the hyper-heuristic's value comes from adapting operators when the GA struggles, not from uniformly improving every instance.</w:t>
+      </w:r>
+    </w:p>
+    <w:p>
+      <w:pPr>
+        <w:pStyle w:val="ListNumber"/>
+      </w:pPr>
+      <w:r>
+        <w:rPr>
+          <w:b/>
+        </w:rPr>
+        <w:t>The PPO agent learns a non-trivial, interpretable policy.</w:t>
+      </w:r>
+      <w:r>
+        <w:t xml:space="preserve"> The agent does not simply pick one mutation operator and repeat it. Instead, it starts with exclusive use of insertion mutation for high disruption, then transitions toward inversion mutation as the population converges. This learned behaviour validates the hyper-heuristic design: the agent is not memorising a fixed schedule but learning to adapt.</w:t>
+      </w:r>
+    </w:p>
+    <w:p>
+      <w:pPr>
+        <w:pStyle w:val="ListNumber"/>
+      </w:pPr>
+      <w:r>
+        <w:rPr>
+          <w:b/>
+        </w:rPr>
+        <w:t>The results are robust to objective weighting.</w:t>
+      </w:r>
+      <w:r>
+        <w:t xml:space="preserve"> The sensitivity analysis across alpha values of 0.3, 0.5, and 0.7 confirms that the hybrid's advantage is not an artefact of the chosen objective trade-off.</w:t>
+      </w:r>
+    </w:p>
+    <w:p>
+      <w:r>
         <w:drawing>
           <wp:inline xmlns:a="http://schemas.openxmlformats.org/drawingml/2006/main" xmlns:pic="http://schemas.openxmlformats.org/drawingml/2006/picture">
-            <wp:extent cx="5029200" cy="1386459"/>
-            <wp:docPr id="21" name="Picture 21"/>
+            <wp:extent cx="5029200" cy="2980771"/>
+            <wp:docPr id="20" name="Picture 20"/>
             <wp:cNvGraphicFramePr>
               <a:graphicFrameLocks noChangeAspect="1"/>
             </wp:cNvGraphicFramePr>
@@ -12136,469 +12536,7 @@
               <a:graphicData uri="http://schemas.openxmlformats.org/drawingml/2006/picture">
                 <pic:pic>
                   <pic:nvPicPr>
-                    <pic:cNvPr id="0" name="05_nn_greedy_failures.png"/>
-                    <pic:cNvPicPr/>
-                  </pic:nvPicPr>
-                  <pic:blipFill>
-                    <a:blip r:embed="rId26"/>
-                    <a:stretch>
-                      <a:fillRect/>
-                    </a:stretch>
-                  </pic:blipFill>
-                  <pic:spPr>
-                    <a:xfrm>
-                      <a:off x="0" y="0"/>
-                      <a:ext cx="5029200" cy="1386459"/>
-                    </a:xfrm>
-                    <a:prstGeom prst="rect"/>
-                  </pic:spPr>
-                </pic:pic>
-              </a:graphicData>
-            </a:graphic>
-          </wp:inline>
-        </w:drawing>
-      </w:r>
-    </w:p>
-    <w:p>
-      <w:pPr>
-        <w:jc w:val="center"/>
-      </w:pPr>
-      <w:r>
-        <w:rPr>
-          <w:i/>
-          <w:sz w:val="18"/>
-        </w:rPr>
-        <w:t>Figure 5.6: Mean and worst-case composite scores for NN-Greedy, GA, and Hybrid across four large instance configurations (lower is better). On n50_m5, NN-Greedy worst-case composite is 2.6× the Hybrid mean. GA and Hybrid worst cases remain within 1.5× their respective means (lower is better).</w:t>
-      </w:r>
-    </w:p>
-    <w:p>
-      <w:pPr>
-        <w:pStyle w:val="Heading1"/>
-      </w:pPr>
-      <w:r>
-        <w:t>5.5 Practical Implications</w:t>
-      </w:r>
-    </w:p>
-    <w:p>
-      <w:r>
-        <w:t>The results have several practical implications for textile dyeing scheduling.</w:t>
-      </w:r>
-    </w:p>
-    <w:p>
-      <w:r>
-        <w:rPr>
-          <w:b/>
-        </w:rPr>
-        <w:t>Cost savings.</w:t>
-      </w:r>
-      <w:r>
-        <w:t xml:space="preserve"> The 34-42% improvement in composite cost on large single-machine instances translates directly to reduced manufacturing costs. In textile dyeing, setup costs represent the chemicals, water, and time required to change colour between batches. A 35% reduction in setup cost on a large production run could save thousands of pounds per week in chemical costs alone, while also reducing water consumption and wastewater treatment requirements.</w:t>
-      </w:r>
-    </w:p>
-    <w:p>
-      <w:r>
-        <w:rPr>
-          <w:b/>
-        </w:rPr>
-        <w:t>Robustness.</w:t>
-      </w:r>
-      <w:r>
-        <w:t xml:space="preserve"> The hybrid approach never produces catastrophic solutions, unlike NN-Greedy. In a real manufacturing environment, schedule quality consistency is critical: a single poor schedule can disrupt downstream processes, miss customer delivery windows, and incur penalty costs. The GA's population-based evaluation naturally filters out poor solutions, and the PPO agent's adaptive mutation further improves worst-case performance.</w:t>
-      </w:r>
-    </w:p>
-    <w:p>
-      <w:r>
-        <w:rPr>
-          <w:b/>
-        </w:rPr>
-        <w:t>Scalability.</w:t>
-      </w:r>
-      <w:r>
-        <w:t xml:space="preserve"> The hybrid advantage increases with problem size, suggesting that the approach becomes more valuable as manufacturing operations scale. Small shops with few jobs may not benefit significantly from the hyper-heuristic, but medium and large operations with 50+ jobs per production run would see meaningful cost reductions.</w:t>
-      </w:r>
-    </w:p>
-    <w:p>
-      <w:r>
-        <w:rPr>
-          <w:b/>
-        </w:rPr>
-        <w:t>Computational cost.</w:t>
-      </w:r>
-      <w:r>
-        <w:t xml:space="preserve"> The hybrid approach requires training the PPO model (approximately 45 minutes) and then executing the GA with the agent's policy. The evaluation GA runs take approximately 2-3 minutes per instance on a modern CPU, compared to under 1 second for NN-Greedy. For offline scheduling (planning production runs a day or two in advance), this computational cost is negligible. For real-time rescheduling in response to machine breakdowns or rush orders, the heuristic baselines may be preferred despite their lower solution quality.</w:t>
-      </w:r>
-    </w:p>
-    <w:p>
-      <w:pPr>
-        <w:pStyle w:val="Heading1"/>
-      </w:pPr>
-      <w:r>
-        <w:t>5.6 Limitations</w:t>
-      </w:r>
-    </w:p>
-    <w:p>
-      <w:r>
-        <w:t>Several limitations of this study should be acknowledged.</w:t>
-      </w:r>
-    </w:p>
-    <w:p>
-      <w:r>
-        <w:rPr>
-          <w:b/>
-        </w:rPr>
-        <w:t>Generalisability to different cost structures.</w:t>
-      </w:r>
-      <w:r>
-        <w:t xml:space="preserve"> The instance generator uses a specific colour-based cost structure motivated by textile dyeing. The generalisation to problem domains with fundamentally different cost structures — such as spatial distance costs or random asymmetry — remains an open question.</w:t>
-      </w:r>
-    </w:p>
-    <w:p>
-      <w:r>
-        <w:rPr>
-          <w:b/>
-        </w:rPr>
-        <w:t>Generalisability to larger instances.</w:t>
-      </w:r>
-      <w:r>
-        <w:t xml:space="preserve"> The PPO agent was trained on instances ranging from n = 10 to n = 500. While this includes extra-large configurations, the generalisation to instances beyond n = 500 has not been tested. It is possible that the policy learned on n = 500 instances would not transfer effectively to n = 1000 or larger problems due to different convergence dynamics at larger scales.</w:t>
-      </w:r>
-    </w:p>
-    <w:p>
-      <w:r>
-        <w:rPr>
-          <w:b/>
-        </w:rPr>
-        <w:t>Observation space completeness.</w:t>
-      </w:r>
-      <w:r>
-        <w:t xml:space="preserve"> The environment exposes only eight observation features to the agent. A richer observation space could include per-machine statistics (load balance, completion times), colour distribution entropy, or historical action effectiveness. Such features might enable the agent to learn a more sophisticated policy with finer-grained control.</w:t>
-      </w:r>
-    </w:p>
-    <w:p>
-      <w:r>
-        <w:rPr>
-          <w:b/>
-        </w:rPr>
-        <w:t>Single DRL algorithm.</w:t>
-      </w:r>
-      <w:r>
-        <w:t xml:space="preserve"> Only PPO was evaluated. Alternative DRL algorithms such as Advantage Actor-Critic (A2C), Soft Actor-Critic (SAC), or Deep Q-Networks (DQN) might achieve different performance levels or exhibit different training dynamics. PPO was chosen for its stability and ease of use, but a systematic comparison of DRL algorithms for this environment could yield additional insights.</w:t>
-      </w:r>
-    </w:p>
-    <w:p>
-      <w:r>
-        <w:rPr>
-          <w:b/>
-        </w:rPr>
-        <w:t>Synthetic data only.</w:t>
-      </w:r>
-      <w:r>
-        <w:t xml:space="preserve"> All experiments used synthetically generated instances with colour-based cost structure. While this provides a clean experimental framework with known ground truth, real manufacturing data may exhibit different cost distributions, due-date structures, and machine constraints. Validation on real factory data would strengthen claims about practical applicability.</w:t>
-      </w:r>
-    </w:p>
-    <w:p>
-      <w:r>
-        <w:rPr>
-          <w:b/>
-        </w:rPr>
-        <w:t>Baseline scope.</w:t>
-      </w:r>
-      <w:r>
-        <w:t xml:space="preserve"> The comparison includes two classical heuristics (SPT and NN-Greedy) and a fixed-mutation GA. More sophisticated scheduling methods such as the NEH heuristic, Ant Colony Optimisation, or Tabu Search were not implemented. The hybrid approach may not outperform all of these on all configurations.</w:t>
-      </w:r>
-    </w:p>
-    <w:p>
-      <w:r>
-        <w:rPr>
-          <w:b/>
-        </w:rPr>
-        <w:t>Training budget.</w:t>
-      </w:r>
-      <w:r>
-        <w:t xml:space="preserve"> The PPO agent was trained for 100,000 timesteps with a reduced population size of 25 and reduced generation count of 100. A longer training budget with the full evaluation parameters might yield a more effective policy. However, the training time increases proportionally, and the current budget was chosen as a pragmatic compromise between policy quality and computational cost.</w:t>
-      </w:r>
-    </w:p>
-    <w:p>
-      <w:pPr>
-        <w:pStyle w:val="Heading1"/>
-      </w:pPr>
-      <w:r>
-        <w:t>5.7 Threats to Validity</w:t>
-      </w:r>
-    </w:p>
-    <w:p>
-      <w:r>
-        <w:rPr>
-          <w:b/>
-        </w:rPr>
-        <w:t>Internal validity.</w:t>
-      </w:r>
-      <w:r>
-        <w:t xml:space="preserve"> DEAP's global state management is a known concern. The implementation addresses this through </w:t>
-      </w:r>
-      <w:r>
-        <w:rPr>
-          <w:rFonts w:ascii="Courier New" w:hAnsi="Courier New"/>
-          <w:sz w:val="18"/>
-        </w:rPr>
-        <w:t>hasattr</w:t>
-      </w:r>
-      <w:r>
-        <w:t xml:space="preserve"> guards in the </w:t>
-      </w:r>
-      <w:r>
-        <w:rPr>
-          <w:rFonts w:ascii="Courier New" w:hAnsi="Courier New"/>
-          <w:sz w:val="18"/>
-        </w:rPr>
-        <w:t>build_toolbox</w:t>
-      </w:r>
-      <w:r>
-        <w:t xml:space="preserve"> function and the use of </w:t>
-      </w:r>
-      <w:r>
-        <w:rPr>
-          <w:rFonts w:ascii="Courier New" w:hAnsi="Courier New"/>
-          <w:sz w:val="18"/>
-        </w:rPr>
-        <w:t>get_context("spawn")</w:t>
-      </w:r>
-      <w:r>
-        <w:t xml:space="preserve"> for multiprocessing. Each worker process re-imports the module and re-registers DEAP types independently, preventing cross-process state contamination. However, within a single process (e.g., running the GA environment in a notebook), repeated calls to </w:t>
-      </w:r>
-      <w:r>
-        <w:rPr>
-          <w:rFonts w:ascii="Courier New" w:hAnsi="Courier New"/>
-          <w:sz w:val="18"/>
-        </w:rPr>
-        <w:t>build_toolbox</w:t>
-      </w:r>
-      <w:r>
-        <w:t xml:space="preserve"> could interact with DEAP's creator registry if the </w:t>
-      </w:r>
-      <w:r>
-        <w:rPr>
-          <w:rFonts w:ascii="Courier New" w:hAnsi="Courier New"/>
-          <w:sz w:val="18"/>
-        </w:rPr>
-        <w:t>hasattr</w:t>
-      </w:r>
-      <w:r>
-        <w:t xml:space="preserve"> guards fail for any reason.</w:t>
-      </w:r>
-    </w:p>
-    <w:p>
-      <w:r>
-        <w:rPr>
-          <w:b/>
-        </w:rPr>
-        <w:t>External validity.</w:t>
-      </w:r>
-      <w:r>
-        <w:t xml:space="preserve"> The results may not transfer to different problem domains with different cost structures. The colour-based asymmetry in this study produces a specific pattern of setup costs (dark-to-light transitions are consistently expensive). Problems with different cost structures — such as random asymmetry or distance-based costs — might favour different mutation strategies. The robustness of the hybrid approach across cost structures remains an open question.</w:t>
-      </w:r>
-    </w:p>
-    <w:p>
-      <w:r>
-        <w:rPr>
-          <w:b/>
-        </w:rPr>
-        <w:t>Construct validity.</w:t>
-      </w:r>
-      <w:r>
-        <w:t xml:space="preserve"> The composite objective with alpha = 0.5 represents a specific trade-off between tardiness and setup cost. While the sensitivity analysis shows that results are stable across alpha values, the choice of alpha remains somewhat arbitrary. A more thorough approach would treat this as a multi-objective optimisation problem and compare Pareto fronts. The significance of the results relative to this concern is somewhat mitigated by the sensitivity analysis, which confirms the pattern holds across the tested range. Additionally, the normalisation procedure using empirically sampled scales introduces a dependence on the specific schedules used for estimation, though this dependence is consistent across all algorithms compared on the same instance.</w:t>
-      </w:r>
-    </w:p>
-    <w:p>
-      <w:r>
-        <w:rPr>
-          <w:b/>
-        </w:rPr>
-        <w:t>Statistical conclusion validity.</w:t>
-      </w:r>
-      <w:r>
-        <w:t xml:space="preserve"> The Wilcoxon signed-rank test is appropriate for the paired experimental design and does not assume normality. The sample size of 50 is adequate for this test. However, the use of multiple comparisons (eight configurations, multiple baseline comparisons) inflates the family-wise error rate. However, the hybrid vs GA comparisons on large instances (p &lt; 0.001) survive even conservative Bonferroni corrections.</w:t>
-      </w:r>
-    </w:p>
-    <w:p>
-      <w:pPr>
-        <w:pStyle w:val="Title"/>
-      </w:pPr>
-      <w:r>
-        <w:t>Chapter 6. Conclusions and Future Work</w:t>
-      </w:r>
-    </w:p>
-    <w:p>
-      <w:pPr>
-        <w:pStyle w:val="Heading1"/>
-      </w:pPr>
-      <w:r>
-        <w:t>6.1 Summary of Contributions</w:t>
-      </w:r>
-    </w:p>
-    <w:p>
-      <w:r>
-        <w:t>This project investigated a hybrid approach combining Genetic Algorithms with Deep Reinforcement Learning for solving the parallel machine scheduling problem with asymmetric, sequence-dependent setup costs. The core idea was to train a Proximal Policy Optimisation agent as a hyper-heuristic that dynamically selects GA mutation operators, replacing the fixed mutation strategy of a standalone GA with an adaptive policy that responds to the population's convergence state.</w:t>
-      </w:r>
-    </w:p>
-    <w:p>
-      <w:r>
-        <w:t>The primary contributions of this work are:</w:t>
-      </w:r>
-    </w:p>
-    <w:p>
-      <w:pPr>
-        <w:pStyle w:val="ListNumber"/>
-      </w:pPr>
-      <w:r>
-        <w:rPr>
-          <w:b/>
-        </w:rPr>
-        <w:t>Problem formalisation.</w:t>
-      </w:r>
-      <w:r>
-        <w:t xml:space="preserve"> The PMSP-SDSC problem with colour-based asymmetric cost structure was formalised, including a synthetic instance generator with weekly capacity calibration, setup-time-to-processing-time ratio of 1/8, and reproducible seeding. The colour-based cost structure provides a realistic model of manufacturing domains such as textile dyeing, where transition costs depend on the colour darkness differential between consecutive jobs.</w:t>
-      </w:r>
-    </w:p>
-    <w:p>
-      <w:pPr>
-        <w:pStyle w:val="ListNumber"/>
-      </w:pPr>
-      <w:r>
-        <w:rPr>
-          <w:b/>
-        </w:rPr>
-        <w:t>Environment design.</w:t>
-      </w:r>
-      <w:r>
-        <w:t xml:space="preserve"> A Gymnasium environment was designed to wrap the GA execution loop, exposing an 8-dimensional continuous observation space covering fitness progress, population convergence, diversity, stagnation, problem scale, and cost structure. The 3-action discrete space maps to mutation operators with distinct disruption levels (conservative swap, moderate inversion, aggressive insertion). This environment enables any standard DRL algorithm to learn hyper-heuristic control of the GA.</w:t>
-      </w:r>
-    </w:p>
-    <w:p>
-      <w:pPr>
-        <w:pStyle w:val="ListNumber"/>
-      </w:pPr>
-      <w:r>
-        <w:rPr>
-          <w:b/>
-        </w:rPr>
-        <w:t>Empirical demonstration.</w:t>
-      </w:r>
-      <w:r>
-        <w:t xml:space="preserve"> Through experiments across eight instance configurations with 50 random seeds each, the hybrid approach was shown to significantly outperform both classical heuristics and standalone GA on large instances. The hybrid achieved a 34-42% improvement over GA on large single-machine instances, with statistical significance at p &lt; 0.001. On multi-machine instances, the improvement ranged from 7% to 18%.</w:t>
-      </w:r>
-    </w:p>
-    <w:p>
-      <w:pPr>
-        <w:pStyle w:val="ListNumber"/>
-      </w:pPr>
-      <w:r>
-        <w:rPr>
-          <w:b/>
-        </w:rPr>
-        <w:t>Scalability.</w:t>
-      </w:r>
-      <w:r>
-        <w:t xml:space="preserve"> The hybrid advantage increases with problem size, demonstrating that the hyper-heuristic approach becomes increasingly valuable as the search space grows and the GA's fixed-mutation limitation becomes more constraining.</w:t>
-      </w:r>
-    </w:p>
-    <w:p>
-      <w:pPr>
-        <w:pStyle w:val="ListNumber"/>
-      </w:pPr>
-      <w:r>
-        <w:rPr>
-          <w:b/>
-        </w:rPr>
-        <w:t>Behavioural insight.</w:t>
-      </w:r>
-      <w:r>
-        <w:t xml:space="preserve"> The action frequency analysis revealed that the PPO agent learns a meaningful and interpretable policy: it applies high-disruption insertion mutation during early generations and transitions to moderate-disruption inversion mutation as the population converges, completely rejecting the conservative swap operator. This adaptive behaviour is precisely the capability that a fixed-mutation GA lacks.</w:t>
-      </w:r>
-    </w:p>
-    <w:p>
-      <w:pPr>
-        <w:pStyle w:val="Heading1"/>
-      </w:pPr>
-      <w:r>
-        <w:t>6.2 Key Findings</w:t>
-      </w:r>
-    </w:p>
-    <w:p>
-      <w:r>
-        <w:t>The following key findings emerge from this study:</w:t>
-      </w:r>
-    </w:p>
-    <w:p>
-      <w:pPr>
-        <w:pStyle w:val="ListNumber"/>
-      </w:pPr>
-      <w:r>
-        <w:rPr>
-          <w:b/>
-        </w:rPr>
-        <w:t>The hybrid approach significantly outperforms standalone GA on large instances.</w:t>
-      </w:r>
-      <w:r>
-        <w:t xml:space="preserve"> On the n50_m1 configuration (n = 100, m = 1), the hybrid achieved composite scores 42% lower than GA (p &lt; 0.001). On xn50_m1 (n = 500, m = 1), the improvement is 34%. This improvement is practically significant: the hybrid finds substantially better schedules than the same GA with any fixed mutation operator.</w:t>
-      </w:r>
-    </w:p>
-    <w:p>
-      <w:pPr>
-        <w:pStyle w:val="ListNumber"/>
-      </w:pPr>
-      <w:r>
-        <w:rPr>
-          <w:b/>
-        </w:rPr>
-        <w:t>The performance gap grows with problem size.</w:t>
-      </w:r>
-      <w:r>
-        <w:t xml:space="preserve"> On small instances (n = 10-20), GA and Hybrid are equivalent or show marginal improvement (≤ 5%). On large instances (n ≥ 50), the gap is substantial and significant. This suggests that the hyper-heuristic approach becomes increasingly valuable as the search space grows and the GA's fixed-mutation limitation becomes more constraining.</w:t>
-      </w:r>
-    </w:p>
-    <w:p>
-      <w:pPr>
-        <w:pStyle w:val="ListNumber"/>
-      </w:pPr>
-      <w:r>
-        <w:rPr>
-          <w:b/>
-        </w:rPr>
-        <w:t>The PPO agent learns a non-trivial, interpretable policy.</w:t>
-      </w:r>
-      <w:r>
-        <w:t xml:space="preserve"> The agent does not simply pick one mutation operator and repeat it. Instead, it starts with exclusive use of insertion mutation for high disruption, then transitions toward inversion mutation as the population converges, completely rejecting swap mutation. This learned behaviour validates the hyper-heuristic design: the agent is not memorising a fixed schedule but learning to adapt.</w:t>
-      </w:r>
-    </w:p>
-    <w:p>
-      <w:pPr>
-        <w:pStyle w:val="ListNumber"/>
-      </w:pPr>
-      <w:r>
-        <w:rPr>
-          <w:b/>
-        </w:rPr>
-        <w:t>The results are robust to objective weighting.</w:t>
-      </w:r>
-      <w:r>
-        <w:t xml:space="preserve"> The sensitivity analysis across alpha values of 0.3, 0.5, and 0.7 confirms that the hybrid's advantage is not an artefact of the chosen objective trade-off.</w:t>
-      </w:r>
-    </w:p>
-    <w:p>
-      <w:r>
-        <w:drawing>
-          <wp:inline xmlns:a="http://schemas.openxmlformats.org/drawingml/2006/main" xmlns:pic="http://schemas.openxmlformats.org/drawingml/2006/picture">
-            <wp:extent cx="5029200" cy="2980771"/>
-            <wp:docPr id="22" name="Picture 22"/>
-            <wp:cNvGraphicFramePr>
-              <a:graphicFrameLocks noChangeAspect="1"/>
-            </wp:cNvGraphicFramePr>
-            <a:graphic>
-              <a:graphicData uri="http://schemas.openxmlformats.org/drawingml/2006/picture">
-                <pic:pic>
-                  <pic:nvPicPr>
-                    <pic:cNvPr id="0" name="06_convergence.png"/>
+                    <pic:cNvPr id="0" name="06_convergence_j20_m5.png"/>
                     <pic:cNvPicPr/>
                   </pic:nvPicPr>
                   <pic:blipFill>
@@ -12630,14 +12568,110 @@
           <w:i/>
           <w:sz w:val="18"/>
         </w:rPr>
-        <w:t>Figure 6.1: Convergence comparison on n50_m1 seed=28 (lower is better). Hybrid converges to 0.260 versus GA 0.285, a 9% improvement on this specific seed. The Hybrid consistently outperforms GA throughout the run. On average across all seeds, the Hybrid achieves a 47% improvement over GA on this instance (see Figure 4.6).</w:t>
+        <w:t>Figure 6.1: Convergence comparison on j20_m5 seed=20 (lower is better). The hybrid converges to a lower composite score than GA throughout the run, consistent with its mean 29.9% improvement over GA on this configuration.</w:t>
       </w:r>
     </w:p>
     <w:p>
       <w:r>
         <w:drawing>
           <wp:inline xmlns:a="http://schemas.openxmlformats.org/drawingml/2006/main" xmlns:pic="http://schemas.openxmlformats.org/drawingml/2006/picture">
-            <wp:extent cx="5029200" cy="2980771"/>
+            <wp:extent cx="5029200" cy="2978755"/>
+            <wp:docPr id="21" name="Picture 21"/>
+            <wp:cNvGraphicFramePr>
+              <a:graphicFrameLocks noChangeAspect="1"/>
+            </wp:cNvGraphicFramePr>
+            <a:graphic>
+              <a:graphicData uri="http://schemas.openxmlformats.org/drawingml/2006/picture">
+                <pic:pic>
+                  <pic:nvPicPr>
+                    <pic:cNvPr id="0" name="06_convergence_j21_m3.png"/>
+                    <pic:cNvPicPr/>
+                  </pic:nvPicPr>
+                  <pic:blipFill>
+                    <a:blip r:embed="rId25"/>
+                    <a:stretch>
+                      <a:fillRect/>
+                    </a:stretch>
+                  </pic:blipFill>
+                  <pic:spPr>
+                    <a:xfrm>
+                      <a:off x="0" y="0"/>
+                      <a:ext cx="5029200" cy="2978755"/>
+                    </a:xfrm>
+                    <a:prstGeom prst="rect"/>
+                  </pic:spPr>
+                </pic:pic>
+              </a:graphicData>
+            </a:graphic>
+          </wp:inline>
+        </w:drawing>
+      </w:r>
+    </w:p>
+    <w:p>
+      <w:pPr>
+        <w:jc w:val="center"/>
+      </w:pPr>
+      <w:r>
+        <w:rPr>
+          <w:i/>
+          <w:sz w:val="18"/>
+        </w:rPr>
+        <w:t>Figure 6.2: Convergence stability comparison on j21_m3 seed=7 (lower is better). GA oscillates across a wider fitness range; the hybrid's convergence is smoother and more predictable, with less inter-generation oscillation.</w:t>
+      </w:r>
+    </w:p>
+    <w:p>
+      <w:r>
+        <w:drawing>
+          <wp:inline xmlns:a="http://schemas.openxmlformats.org/drawingml/2006/main" xmlns:pic="http://schemas.openxmlformats.org/drawingml/2006/picture">
+            <wp:extent cx="5029200" cy="4009597"/>
+            <wp:docPr id="22" name="Picture 22"/>
+            <wp:cNvGraphicFramePr>
+              <a:graphicFrameLocks noChangeAspect="1"/>
+            </wp:cNvGraphicFramePr>
+            <a:graphic>
+              <a:graphicData uri="http://schemas.openxmlformats.org/drawingml/2006/picture">
+                <pic:pic>
+                  <pic:nvPicPr>
+                    <pic:cNvPr id="0" name="06_gantt_j20_m5.png"/>
+                    <pic:cNvPicPr/>
+                  </pic:nvPicPr>
+                  <pic:blipFill>
+                    <a:blip r:embed="rId20"/>
+                    <a:stretch>
+                      <a:fillRect/>
+                    </a:stretch>
+                  </pic:blipFill>
+                  <pic:spPr>
+                    <a:xfrm>
+                      <a:off x="0" y="0"/>
+                      <a:ext cx="5029200" cy="4009597"/>
+                    </a:xfrm>
+                    <a:prstGeom prst="rect"/>
+                  </pic:spPr>
+                </pic:pic>
+              </a:graphicData>
+            </a:graphic>
+          </wp:inline>
+        </w:drawing>
+      </w:r>
+    </w:p>
+    <w:p>
+      <w:pPr>
+        <w:jc w:val="center"/>
+      </w:pPr>
+      <w:r>
+        <w:rPr>
+          <w:i/>
+          <w:sz w:val="18"/>
+        </w:rPr>
+        <w:t>Figure 6.3: Gantt chart comparison (SPT, GA, Hybrid) on j20_m5 (100 jobs, 5 machines). The GA and Hybrid schedules show better colour-category clustering than SPT, reducing sequence-dependent setup time between jobs.</w:t>
+      </w:r>
+    </w:p>
+    <w:p>
+      <w:r>
+        <w:drawing>
+          <wp:inline xmlns:a="http://schemas.openxmlformats.org/drawingml/2006/main" xmlns:pic="http://schemas.openxmlformats.org/drawingml/2006/picture">
+            <wp:extent cx="5029200" cy="4009597"/>
             <wp:docPr id="23" name="Picture 23"/>
             <wp:cNvGraphicFramePr>
               <a:graphicFrameLocks noChangeAspect="1"/>
@@ -12646,7 +12680,55 @@
               <a:graphicData uri="http://schemas.openxmlformats.org/drawingml/2006/picture">
                 <pic:pic>
                   <pic:nvPicPr>
-                    <pic:cNvPr id="0" name="06_convergence_stability.png"/>
+                    <pic:cNvPr id="0" name="06_gantt_j30_m5.png"/>
+                    <pic:cNvPicPr/>
+                  </pic:nvPicPr>
+                  <pic:blipFill>
+                    <a:blip r:embed="rId26"/>
+                    <a:stretch>
+                      <a:fillRect/>
+                    </a:stretch>
+                  </pic:blipFill>
+                  <pic:spPr>
+                    <a:xfrm>
+                      <a:off x="0" y="0"/>
+                      <a:ext cx="5029200" cy="4009597"/>
+                    </a:xfrm>
+                    <a:prstGeom prst="rect"/>
+                  </pic:spPr>
+                </pic:pic>
+              </a:graphicData>
+            </a:graphic>
+          </wp:inline>
+        </w:drawing>
+      </w:r>
+    </w:p>
+    <w:p>
+      <w:pPr>
+        <w:jc w:val="center"/>
+      </w:pPr>
+      <w:r>
+        <w:rPr>
+          <w:i/>
+          <w:sz w:val="18"/>
+        </w:rPr>
+        <w:t>Figure 6.4: Gantt chart on j30_m5 (150 jobs, 5 machines, overloaded). The hybrid maintains colour groupings even under capacity pressure, reducing setup time relative to SPT.</w:t>
+      </w:r>
+    </w:p>
+    <w:p>
+      <w:r>
+        <w:drawing>
+          <wp:inline xmlns:a="http://schemas.openxmlformats.org/drawingml/2006/main" xmlns:pic="http://schemas.openxmlformats.org/drawingml/2006/picture">
+            <wp:extent cx="5029200" cy="4902803"/>
+            <wp:docPr id="24" name="Picture 24"/>
+            <wp:cNvGraphicFramePr>
+              <a:graphicFrameLocks noChangeAspect="1"/>
+            </wp:cNvGraphicFramePr>
+            <a:graphic>
+              <a:graphicData uri="http://schemas.openxmlformats.org/drawingml/2006/picture">
+                <pic:pic>
+                  <pic:nvPicPr>
+                    <pic:cNvPr id="0" name="06_gantt_j30_m1.png"/>
                     <pic:cNvPicPr/>
                   </pic:nvPicPr>
                   <pic:blipFill>
@@ -12658,7 +12740,7 @@
                   <pic:spPr>
                     <a:xfrm>
                       <a:off x="0" y="0"/>
-                      <a:ext cx="5029200" cy="2980771"/>
+                      <a:ext cx="5029200" cy="4902803"/>
                     </a:xfrm>
                     <a:prstGeom prst="rect"/>
                   </pic:spPr>
@@ -12678,151 +12760,7 @@
           <w:i/>
           <w:sz w:val="18"/>
         </w:rPr>
-        <w:t>Figure 6.2: Convergence stability comparison (seed=23, n50_m1, lower is better). GA oscillates across a fitness range of 0.272; Hybrid range is 0.219, converging to 0.185 versus GA 0.272. The Hybrid's convergence is smoother and more predictable, with less inter-generation oscillation.</w:t>
-      </w:r>
-    </w:p>
-    <w:p>
-      <w:r>
-        <w:drawing>
-          <wp:inline xmlns:a="http://schemas.openxmlformats.org/drawingml/2006/main" xmlns:pic="http://schemas.openxmlformats.org/drawingml/2006/picture">
-            <wp:extent cx="5029200" cy="4006788"/>
-            <wp:docPr id="24" name="Picture 24"/>
-            <wp:cNvGraphicFramePr>
-              <a:graphicFrameLocks noChangeAspect="1"/>
-            </wp:cNvGraphicFramePr>
-            <a:graphic>
-              <a:graphicData uri="http://schemas.openxmlformats.org/drawingml/2006/picture">
-                <pic:pic>
-                  <pic:nvPicPr>
-                    <pic:cNvPr id="0" name="06_gantt_comparison.png"/>
-                    <pic:cNvPicPr/>
-                  </pic:nvPicPr>
-                  <pic:blipFill>
-                    <a:blip r:embed="rId20"/>
-                    <a:stretch>
-                      <a:fillRect/>
-                    </a:stretch>
-                  </pic:blipFill>
-                  <pic:spPr>
-                    <a:xfrm>
-                      <a:off x="0" y="0"/>
-                      <a:ext cx="5029200" cy="4006788"/>
-                    </a:xfrm>
-                    <a:prstGeom prst="rect"/>
-                  </pic:spPr>
-                </pic:pic>
-              </a:graphicData>
-            </a:graphic>
-          </wp:inline>
-        </w:drawing>
-      </w:r>
-    </w:p>
-    <w:p>
-      <w:pPr>
-        <w:jc w:val="center"/>
-      </w:pPr>
-      <w:r>
-        <w:rPr>
-          <w:i/>
-          <w:sz w:val="18"/>
-        </w:rPr>
-        <w:t>Figure 6.3: Gantt chart comparison (SPT, GA, Hybrid) on a multi-machine instance. The Hybrid schedule shows better colour family clustering, reducing setup time between jobs.</w:t>
-      </w:r>
-    </w:p>
-    <w:p>
-      <w:r>
-        <w:drawing>
-          <wp:inline xmlns:a="http://schemas.openxmlformats.org/drawingml/2006/main" xmlns:pic="http://schemas.openxmlformats.org/drawingml/2006/picture">
-            <wp:extent cx="5029200" cy="4006788"/>
-            <wp:docPr id="25" name="Picture 25"/>
-            <wp:cNvGraphicFramePr>
-              <a:graphicFrameLocks noChangeAspect="1"/>
-            </wp:cNvGraphicFramePr>
-            <a:graphic>
-              <a:graphicData uri="http://schemas.openxmlformats.org/drawingml/2006/picture">
-                <pic:pic>
-                  <pic:nvPicPr>
-                    <pic:cNvPr id="0" name="06_gantt_multi_5m.png"/>
-                    <pic:cNvPicPr/>
-                  </pic:nvPicPr>
-                  <pic:blipFill>
-                    <a:blip r:embed="rId28"/>
-                    <a:stretch>
-                      <a:fillRect/>
-                    </a:stretch>
-                  </pic:blipFill>
-                  <pic:spPr>
-                    <a:xfrm>
-                      <a:off x="0" y="0"/>
-                      <a:ext cx="5029200" cy="4006788"/>
-                    </a:xfrm>
-                    <a:prstGeom prst="rect"/>
-                  </pic:spPr>
-                </pic:pic>
-              </a:graphicData>
-            </a:graphic>
-          </wp:inline>
-        </w:drawing>
-      </w:r>
-    </w:p>
-    <w:p>
-      <w:pPr>
-        <w:jc w:val="center"/>
-      </w:pPr>
-      <w:r>
-        <w:rPr>
-          <w:i/>
-          <w:sz w:val="18"/>
-        </w:rPr>
-        <w:t>Figure 6.4: Multi-machine Gantt chart on n100_m5 (100 jobs, 5 machines). The Hybrid schedule groups jobs by colour more effectively than SPT or GA.</w:t>
-      </w:r>
-    </w:p>
-    <w:p>
-      <w:r>
-        <w:drawing>
-          <wp:inline xmlns:a="http://schemas.openxmlformats.org/drawingml/2006/main" xmlns:pic="http://schemas.openxmlformats.org/drawingml/2006/picture">
-            <wp:extent cx="5029200" cy="4899994"/>
-            <wp:docPr id="26" name="Picture 26"/>
-            <wp:cNvGraphicFramePr>
-              <a:graphicFrameLocks noChangeAspect="1"/>
-            </wp:cNvGraphicFramePr>
-            <a:graphic>
-              <a:graphicData uri="http://schemas.openxmlformats.org/drawingml/2006/picture">
-                <pic:pic>
-                  <pic:nvPicPr>
-                    <pic:cNvPr id="0" name="06_gantt_multi_10m_100.png"/>
-                    <pic:cNvPicPr/>
-                  </pic:nvPicPr>
-                  <pic:blipFill>
-                    <a:blip r:embed="rId29"/>
-                    <a:stretch>
-                      <a:fillRect/>
-                    </a:stretch>
-                  </pic:blipFill>
-                  <pic:spPr>
-                    <a:xfrm>
-                      <a:off x="0" y="0"/>
-                      <a:ext cx="5029200" cy="4899994"/>
-                    </a:xfrm>
-                    <a:prstGeom prst="rect"/>
-                  </pic:spPr>
-                </pic:pic>
-              </a:graphicData>
-            </a:graphic>
-          </wp:inline>
-        </w:drawing>
-      </w:r>
-    </w:p>
-    <w:p>
-      <w:pPr>
-        <w:jc w:val="center"/>
-      </w:pPr>
-      <w:r>
-        <w:rPr>
-          <w:i/>
-          <w:sz w:val="18"/>
-        </w:rPr>
-        <w:t>Figure 6.5: Multi-machine Gantt chart on n100_m10 (100 jobs, 10 machines). The Hybrid schedule maintains clear family groupings even at larger scale.</w:t>
+        <w:t>Figure 6.5: Gantt chart on j30_m1 (30 jobs, single machine, overloaded). Even on a single machine the hybrid groups jobs by colour family to lower sequence-dependent setup costs.</w:t>
       </w:r>
     </w:p>
     <w:p>

</xml_diff>